<commit_message>
aplicacion agencia postal EnviaYa
versión final del sistema EnvíaYa con GUI y recursividad" -m "Detalles del commit:
- Creación de interfaz gráfica interactiva con Tkinter (gui.py).
- Implementación del motor de procesamiento usando exclusivamente funciones recursivas (logica.py).
- Integración de funciones para registrar paquetes, consolidar carga y filtrar críticos.
- Aplicación de estilos globales y colores personalizados a los botones.
entrega final del proyecto EnvíaYa (Tkinter + lógica recursiva completada
</commit_message>
<xml_diff>
--- a/Proyecto 07 EnviaYa.docx
+++ b/Proyecto 07 EnviaYa.docx
@@ -37,23 +37,29 @@
         </w:rPr>
         <w:t>Estación de Envíos y Paquetes ´</w:t>
       </w:r>
-      <w:proofErr w:type="spellStart"/>
-      <w:r>
-        <w:rPr>
-          <w:rFonts w:ascii="Times New Roman" w:eastAsia="Times New Roman" w:hAnsi="Times New Roman" w:cs="Times New Roman"/>
-          <w:i/>
-          <w:iCs/>
-        </w:rPr>
-        <w:t>EnviaYa</w:t>
-      </w:r>
-      <w:proofErr w:type="spellEnd"/>
-      <w:r>
-        <w:rPr>
-          <w:rFonts w:ascii="Times New Roman" w:eastAsia="Times New Roman" w:hAnsi="Times New Roman" w:cs="Times New Roman"/>
-          <w:i/>
-          <w:iCs/>
-        </w:rPr>
-        <w:t>´</w:t>
+      <w:r>
+        <w:rPr>
+          <w:rFonts w:ascii="Times New Roman" w:eastAsia="Times New Roman" w:hAnsi="Times New Roman" w:cs="Times New Roman"/>
+          <w:i/>
+          <w:iCs/>
+        </w:rPr>
+        <w:t>Envía</w:t>
+      </w:r>
+      <w:r>
+        <w:rPr>
+          <w:rFonts w:ascii="Times New Roman" w:eastAsia="Times New Roman" w:hAnsi="Times New Roman" w:cs="Times New Roman"/>
+          <w:i/>
+          <w:iCs/>
+        </w:rPr>
+        <w:t xml:space="preserve"> </w:t>
+      </w:r>
+      <w:r>
+        <w:rPr>
+          <w:rFonts w:ascii="Times New Roman" w:eastAsia="Times New Roman" w:hAnsi="Times New Roman" w:cs="Times New Roman"/>
+          <w:i/>
+          <w:iCs/>
+        </w:rPr>
+        <w:t>Ya´</w:t>
       </w:r>
     </w:p>
     <w:p>
@@ -183,7 +189,6 @@
           <w:rFonts w:ascii="Times New Roman" w:eastAsia="Times New Roman" w:hAnsi="Times New Roman" w:cs="Times New Roman"/>
           <w:i/>
           <w:iCs/>
-          <w:lang w:val="en-US"/>
         </w:rPr>
       </w:pPr>
       <w:r>
@@ -199,7 +204,6 @@
           <w:rFonts w:ascii="Times New Roman" w:eastAsia="Times New Roman" w:hAnsi="Times New Roman" w:cs="Times New Roman"/>
           <w:i/>
           <w:iCs/>
-          <w:lang w:val="en-US"/>
         </w:rPr>
         <w:t>:</w:t>
       </w:r>
@@ -217,79 +221,44 @@
           <w:rFonts w:ascii="Times New Roman" w:hAnsi="Times New Roman" w:cs="Times New Roman"/>
           <w:i/>
         </w:rPr>
-        <w:t xml:space="preserve">ANDREA HERRERA PATIÑO – </w:t>
-      </w:r>
-      <w:r>
+        <w:t>ANDREA HERRERA PATIÑO – 202651161-2724</w:t>
+      </w:r>
+    </w:p>
+    <w:p>
+      <w:pPr>
+        <w:jc w:val="center"/>
         <w:rPr>
           <w:rFonts w:ascii="Times New Roman" w:hAnsi="Times New Roman" w:cs="Times New Roman"/>
           <w:i/>
         </w:rPr>
-        <w:t>202651161</w:t>
-      </w:r>
+      </w:pPr>
       <w:r>
         <w:rPr>
           <w:rFonts w:ascii="Times New Roman" w:hAnsi="Times New Roman" w:cs="Times New Roman"/>
           <w:i/>
         </w:rPr>
-        <w:t xml:space="preserve">-2724 </w:t>
-      </w:r>
-    </w:p>
-    <w:p>
-      <w:pPr>
-        <w:jc w:val="center"/>
+        <w:t xml:space="preserve">ANDERSON </w:t>
+      </w:r>
+      <w:r>
         <w:rPr>
           <w:rFonts w:ascii="Times New Roman" w:hAnsi="Times New Roman" w:cs="Times New Roman"/>
           <w:i/>
         </w:rPr>
-      </w:pPr>
+        <w:t>GEOVANNY LOPEZ RAMIREZ</w:t>
+      </w:r>
       <w:r>
         <w:rPr>
           <w:rFonts w:ascii="Times New Roman" w:hAnsi="Times New Roman" w:cs="Times New Roman"/>
           <w:i/>
         </w:rPr>
-        <w:t xml:space="preserve">ANDERSON </w:t>
+        <w:t xml:space="preserve"> – </w:t>
       </w:r>
       <w:r>
         <w:rPr>
           <w:rFonts w:ascii="Times New Roman" w:hAnsi="Times New Roman" w:cs="Times New Roman"/>
           <w:i/>
         </w:rPr>
-        <w:t>GEOVANNY LOPEZ RAMIREZ</w:t>
-      </w:r>
-      <w:r>
-        <w:rPr>
-          <w:rFonts w:ascii="Times New Roman" w:hAnsi="Times New Roman" w:cs="Times New Roman"/>
-          <w:i/>
-        </w:rPr>
-        <w:t xml:space="preserve"> </w:t>
-      </w:r>
-      <w:r>
-        <w:rPr>
-          <w:rFonts w:ascii="Times New Roman" w:hAnsi="Times New Roman" w:cs="Times New Roman"/>
-          <w:i/>
-        </w:rPr>
-        <w:t>–</w:t>
-      </w:r>
-      <w:r>
-        <w:rPr>
-          <w:rFonts w:ascii="Times New Roman" w:hAnsi="Times New Roman" w:cs="Times New Roman"/>
-          <w:i/>
-        </w:rPr>
-        <w:t xml:space="preserve"> </w:t>
-      </w:r>
-      <w:r>
-        <w:rPr>
-          <w:rFonts w:ascii="Times New Roman" w:hAnsi="Times New Roman" w:cs="Times New Roman"/>
-          <w:i/>
-        </w:rPr>
         <w:t>200860206-2724</w:t>
-      </w:r>
-      <w:r>
-        <w:rPr>
-          <w:rFonts w:ascii="Times New Roman" w:hAnsi="Times New Roman" w:cs="Times New Roman"/>
-          <w:i/>
-        </w:rPr>
-        <w:t xml:space="preserve"> </w:t>
       </w:r>
     </w:p>
     <w:p>
@@ -661,7 +630,10 @@
         </w:rPr>
         <w:t>UNDAMENTOS DE PROGRAMACIÓN IMPERATIVA</w:t>
       </w:r>
-      <w:r>
+    </w:p>
+    <w:p>
+      <w:pPr>
+        <w:jc w:val="center"/>
         <w:rPr>
           <w:rFonts w:ascii="Times New Roman" w:hAnsi="Times New Roman" w:cs="Times New Roman"/>
           <w:i/>
@@ -669,7 +641,13 @@
           <w:sz w:val="26"/>
           <w:szCs w:val="26"/>
         </w:rPr>
-        <w:t xml:space="preserve"> </w:t>
+      </w:pPr>
+      <w:r>
+        <w:rPr>
+          <w:rFonts w:ascii="Times New Roman" w:hAnsi="Times New Roman" w:cs="Times New Roman"/>
+          <w:i/>
+        </w:rPr>
+        <w:t>UNIVERSIDAD DEL VALLE SECCIONAL BUGA</w:t>
       </w:r>
     </w:p>
     <w:p>
@@ -687,21 +665,12 @@
         <w:rPr>
           <w:rFonts w:ascii="Times New Roman" w:hAnsi="Times New Roman" w:cs="Times New Roman"/>
           <w:i/>
-        </w:rPr>
-        <w:t>UNIVERSIDAD DEL VALLE SECCIONAL BUGA</w:t>
-      </w:r>
-    </w:p>
-    <w:p>
-      <w:pPr>
-        <w:jc w:val="center"/>
-        <w:rPr>
-          <w:rFonts w:ascii="Times New Roman" w:hAnsi="Times New Roman" w:cs="Times New Roman"/>
-          <w:i/>
           <w:iCs/>
           <w:sz w:val="26"/>
           <w:szCs w:val="26"/>
         </w:rPr>
-      </w:pPr>
+        <w:t>31</w:t>
+      </w:r>
       <w:r>
         <w:rPr>
           <w:rFonts w:ascii="Times New Roman" w:hAnsi="Times New Roman" w:cs="Times New Roman"/>
@@ -710,7 +679,7 @@
           <w:sz w:val="26"/>
           <w:szCs w:val="26"/>
         </w:rPr>
-        <w:t>31</w:t>
+        <w:t xml:space="preserve"> JU</w:t>
       </w:r>
       <w:r>
         <w:rPr>
@@ -720,7 +689,7 @@
           <w:sz w:val="26"/>
           <w:szCs w:val="26"/>
         </w:rPr>
-        <w:t xml:space="preserve"> JU</w:t>
+        <w:t>L</w:t>
       </w:r>
       <w:r>
         <w:rPr>
@@ -730,7 +699,7 @@
           <w:sz w:val="26"/>
           <w:szCs w:val="26"/>
         </w:rPr>
-        <w:t>L</w:t>
+        <w:t>IO</w:t>
       </w:r>
       <w:r>
         <w:rPr>
@@ -740,8 +709,18 @@
           <w:sz w:val="26"/>
           <w:szCs w:val="26"/>
         </w:rPr>
-        <w:t>IO</w:t>
-      </w:r>
+        <w:t xml:space="preserve"> DEL 2026</w:t>
+      </w:r>
+    </w:p>
+    <w:p>
+      <w:pPr>
+        <w:jc w:val="center"/>
+        <w:rPr>
+          <w:rFonts w:ascii="Times New Roman" w:eastAsia="Times New Roman" w:hAnsi="Times New Roman" w:cs="Times New Roman"/>
+          <w:i/>
+          <w:iCs/>
+        </w:rPr>
+      </w:pPr>
       <w:r>
         <w:rPr>
           <w:rFonts w:ascii="Times New Roman" w:hAnsi="Times New Roman" w:cs="Times New Roman"/>
@@ -750,26 +729,6 @@
           <w:sz w:val="26"/>
           <w:szCs w:val="26"/>
         </w:rPr>
-        <w:t xml:space="preserve"> DEL 2026 </w:t>
-      </w:r>
-    </w:p>
-    <w:p>
-      <w:pPr>
-        <w:jc w:val="center"/>
-        <w:rPr>
-          <w:rFonts w:ascii="Times New Roman" w:eastAsia="Times New Roman" w:hAnsi="Times New Roman" w:cs="Times New Roman"/>
-          <w:i/>
-          <w:iCs/>
-        </w:rPr>
-      </w:pPr>
-      <w:r>
-        <w:rPr>
-          <w:rFonts w:ascii="Times New Roman" w:hAnsi="Times New Roman" w:cs="Times New Roman"/>
-          <w:i/>
-          <w:iCs/>
-          <w:sz w:val="26"/>
-          <w:szCs w:val="26"/>
-        </w:rPr>
         <w:t>GUADALAJARA DE BUGA</w:t>
       </w:r>
     </w:p>
@@ -817,6 +776,102 @@
         </w:rPr>
         <w:t>Estación de Envíos y Paquetes ´</w:t>
       </w:r>
+      <w:r>
+        <w:rPr>
+          <w:rFonts w:ascii="Times New Roman" w:eastAsia="Times New Roman" w:hAnsi="Times New Roman" w:cs="Times New Roman"/>
+          <w:i/>
+          <w:iCs/>
+        </w:rPr>
+        <w:t>Envía</w:t>
+      </w:r>
+      <w:r>
+        <w:rPr>
+          <w:rFonts w:ascii="Times New Roman" w:eastAsia="Times New Roman" w:hAnsi="Times New Roman" w:cs="Times New Roman"/>
+          <w:i/>
+          <w:iCs/>
+        </w:rPr>
+        <w:t xml:space="preserve"> </w:t>
+      </w:r>
+      <w:r>
+        <w:rPr>
+          <w:rFonts w:ascii="Times New Roman" w:eastAsia="Times New Roman" w:hAnsi="Times New Roman" w:cs="Times New Roman"/>
+          <w:i/>
+          <w:iCs/>
+        </w:rPr>
+        <w:t>Ya´</w:t>
+      </w:r>
+    </w:p>
+    <w:p>
+      <w:pPr>
+        <w:jc w:val="both"/>
+        <w:rPr>
+          <w:rFonts w:ascii="Times New Roman" w:eastAsia="Times New Roman" w:hAnsi="Times New Roman" w:cs="Times New Roman"/>
+          <w:i/>
+          <w:iCs/>
+        </w:rPr>
+      </w:pPr>
+    </w:p>
+    <w:p>
+      <w:pPr>
+        <w:jc w:val="both"/>
+        <w:rPr>
+          <w:rFonts w:ascii="Times New Roman" w:eastAsia="Times New Roman" w:hAnsi="Times New Roman" w:cs="Times New Roman"/>
+          <w:i/>
+          <w:iCs/>
+        </w:rPr>
+      </w:pPr>
+      <w:r>
+        <w:rPr>
+          <w:rFonts w:ascii="Times New Roman" w:eastAsia="Times New Roman" w:hAnsi="Times New Roman" w:cs="Times New Roman"/>
+          <w:i/>
+          <w:iCs/>
+        </w:rPr>
+        <w:t>Resumen del Proyecto</w:t>
+      </w:r>
+    </w:p>
+    <w:p>
+      <w:pPr>
+        <w:jc w:val="both"/>
+        <w:rPr>
+          <w:rFonts w:ascii="Times New Roman" w:eastAsia="Times New Roman" w:hAnsi="Times New Roman" w:cs="Times New Roman"/>
+          <w:i/>
+          <w:iCs/>
+        </w:rPr>
+      </w:pPr>
+    </w:p>
+    <w:p>
+      <w:pPr>
+        <w:jc w:val="both"/>
+        <w:rPr>
+          <w:rFonts w:ascii="Times New Roman" w:eastAsia="Times New Roman" w:hAnsi="Times New Roman" w:cs="Times New Roman"/>
+          <w:i/>
+          <w:iCs/>
+        </w:rPr>
+      </w:pPr>
+      <w:r>
+        <w:rPr>
+          <w:rFonts w:ascii="Times New Roman" w:eastAsia="Times New Roman" w:hAnsi="Times New Roman" w:cs="Times New Roman"/>
+          <w:i/>
+          <w:iCs/>
+        </w:rPr>
+        <w:t>El presente proyecto</w:t>
+      </w:r>
+      <w:r>
+        <w:rPr>
+          <w:rFonts w:ascii="Times New Roman" w:eastAsia="Times New Roman" w:hAnsi="Times New Roman" w:cs="Times New Roman"/>
+          <w:i/>
+          <w:iCs/>
+        </w:rPr>
+        <w:t>,</w:t>
+      </w:r>
+      <w:r>
+        <w:rPr>
+          <w:rFonts w:ascii="Times New Roman" w:eastAsia="Times New Roman" w:hAnsi="Times New Roman" w:cs="Times New Roman"/>
+          <w:i/>
+          <w:iCs/>
+        </w:rPr>
+        <w:t xml:space="preserve"> consiste en el desarrollo de un software de escritorio para la agencia postal '</w:t>
+      </w:r>
       <w:proofErr w:type="spellStart"/>
       <w:r>
         <w:rPr>
@@ -824,7 +879,7 @@
           <w:i/>
           <w:iCs/>
         </w:rPr>
-        <w:t>EnviaYa</w:t>
+        <w:t>EnvíaYa</w:t>
       </w:r>
       <w:proofErr w:type="spellEnd"/>
       <w:r>
@@ -833,18 +888,62 @@
           <w:i/>
           <w:iCs/>
         </w:rPr>
-        <w:t>´</w:t>
-      </w:r>
-    </w:p>
-    <w:p>
-      <w:pPr>
-        <w:jc w:val="center"/>
-        <w:rPr>
-          <w:rFonts w:ascii="Times New Roman" w:eastAsia="Times New Roman" w:hAnsi="Times New Roman" w:cs="Times New Roman"/>
-          <w:i/>
-          <w:iCs/>
-        </w:rPr>
-      </w:pPr>
+        <w:t xml:space="preserve">', diseñado para registrar paquetes en la bahía de carga, evaluar su peso y detectar encomiendas prioritarias. El programa cuenta con una interfaz gráfica construida en </w:t>
+      </w:r>
+      <w:proofErr w:type="spellStart"/>
+      <w:r>
+        <w:rPr>
+          <w:rFonts w:ascii="Times New Roman" w:eastAsia="Times New Roman" w:hAnsi="Times New Roman" w:cs="Times New Roman"/>
+          <w:i/>
+          <w:iCs/>
+        </w:rPr>
+        <w:t>Tkinter</w:t>
+      </w:r>
+      <w:proofErr w:type="spellEnd"/>
+      <w:r>
+        <w:rPr>
+          <w:rFonts w:ascii="Times New Roman" w:eastAsia="Times New Roman" w:hAnsi="Times New Roman" w:cs="Times New Roman"/>
+          <w:i/>
+          <w:iCs/>
+        </w:rPr>
+        <w:t xml:space="preserve"> e implementa un motor de procesamiento de datos exclusivamente recursivo, cumpliendo con la restricción técnica de no utilizar ciclos </w:t>
+      </w:r>
+      <w:proofErr w:type="spellStart"/>
+      <w:r>
+        <w:rPr>
+          <w:rFonts w:ascii="Times New Roman" w:eastAsia="Times New Roman" w:hAnsi="Times New Roman" w:cs="Times New Roman"/>
+          <w:i/>
+          <w:iCs/>
+        </w:rPr>
+        <w:t>for</w:t>
+      </w:r>
+      <w:proofErr w:type="spellEnd"/>
+      <w:r>
+        <w:rPr>
+          <w:rFonts w:ascii="Times New Roman" w:eastAsia="Times New Roman" w:hAnsi="Times New Roman" w:cs="Times New Roman"/>
+          <w:i/>
+          <w:iCs/>
+        </w:rPr>
+        <w:t xml:space="preserve"> o </w:t>
+      </w:r>
+      <w:proofErr w:type="spellStart"/>
+      <w:r>
+        <w:rPr>
+          <w:rFonts w:ascii="Times New Roman" w:eastAsia="Times New Roman" w:hAnsi="Times New Roman" w:cs="Times New Roman"/>
+          <w:i/>
+          <w:iCs/>
+        </w:rPr>
+        <w:t>while</w:t>
+      </w:r>
+      <w:proofErr w:type="spellEnd"/>
+      <w:r>
+        <w:rPr>
+          <w:rFonts w:ascii="Times New Roman" w:eastAsia="Times New Roman" w:hAnsi="Times New Roman" w:cs="Times New Roman"/>
+          <w:i/>
+          <w:iCs/>
+        </w:rPr>
+        <w:t>.</w:t>
+      </w:r>
     </w:p>
     <w:p>
       <w:pPr>
@@ -855,14 +954,1960 @@
           <w:iCs/>
         </w:rPr>
       </w:pPr>
-      <w:r>
-        <w:rPr>
-          <w:rFonts w:ascii="Times New Roman" w:eastAsia="Times New Roman" w:hAnsi="Times New Roman" w:cs="Times New Roman"/>
-          <w:i/>
-          <w:iCs/>
-        </w:rPr>
-        <w:t>12345</w:t>
-      </w:r>
+    </w:p>
+    <w:p>
+      <w:pPr>
+        <w:jc w:val="both"/>
+        <w:rPr>
+          <w:rFonts w:ascii="Times New Roman" w:eastAsia="Times New Roman" w:hAnsi="Times New Roman" w:cs="Times New Roman"/>
+          <w:i/>
+          <w:iCs/>
+        </w:rPr>
+      </w:pPr>
+      <w:r>
+        <w:rPr>
+          <w:rFonts w:ascii="Times New Roman" w:eastAsia="Times New Roman" w:hAnsi="Times New Roman" w:cs="Times New Roman"/>
+          <w:i/>
+          <w:iCs/>
+        </w:rPr>
+        <w:t>EXPLICACIÓN TÉCNICA</w:t>
+      </w:r>
+    </w:p>
+    <w:p>
+      <w:pPr>
+        <w:jc w:val="both"/>
+        <w:rPr>
+          <w:rFonts w:ascii="Times New Roman" w:eastAsia="Times New Roman" w:hAnsi="Times New Roman" w:cs="Times New Roman"/>
+          <w:i/>
+          <w:iCs/>
+        </w:rPr>
+      </w:pPr>
+    </w:p>
+    <w:p>
+      <w:pPr>
+        <w:pStyle w:val="Prrafodelista"/>
+        <w:numPr>
+          <w:ilvl w:val="0"/>
+          <w:numId w:val="23"/>
+        </w:numPr>
+        <w:jc w:val="both"/>
+        <w:rPr>
+          <w:rFonts w:ascii="Times New Roman" w:eastAsia="Times New Roman" w:hAnsi="Times New Roman" w:cs="Times New Roman"/>
+          <w:i/>
+          <w:iCs/>
+        </w:rPr>
+      </w:pPr>
+      <w:r>
+        <w:rPr>
+          <w:rFonts w:ascii="Times New Roman" w:eastAsia="Times New Roman" w:hAnsi="Times New Roman" w:cs="Times New Roman"/>
+          <w:i/>
+          <w:iCs/>
+        </w:rPr>
+        <w:t>Función: calcular_peso_total(</w:t>
+      </w:r>
+      <w:proofErr w:type="spellStart"/>
+      <w:r>
+        <w:rPr>
+          <w:rFonts w:ascii="Times New Roman" w:eastAsia="Times New Roman" w:hAnsi="Times New Roman" w:cs="Times New Roman"/>
+          <w:i/>
+          <w:iCs/>
+        </w:rPr>
+        <w:t>lista_paquetes</w:t>
+      </w:r>
+      <w:proofErr w:type="spellEnd"/>
+      <w:r>
+        <w:rPr>
+          <w:rFonts w:ascii="Times New Roman" w:eastAsia="Times New Roman" w:hAnsi="Times New Roman" w:cs="Times New Roman"/>
+          <w:i/>
+          <w:iCs/>
+        </w:rPr>
+        <w:t>)</w:t>
+      </w:r>
+    </w:p>
+    <w:p>
+      <w:pPr>
+        <w:jc w:val="both"/>
+        <w:rPr>
+          <w:rFonts w:ascii="Times New Roman" w:eastAsia="Times New Roman" w:hAnsi="Times New Roman" w:cs="Times New Roman"/>
+          <w:i/>
+          <w:iCs/>
+        </w:rPr>
+      </w:pPr>
+    </w:p>
+    <w:p>
+      <w:pPr>
+        <w:jc w:val="both"/>
+        <w:rPr>
+          <w:rFonts w:ascii="Times New Roman" w:eastAsia="Times New Roman" w:hAnsi="Times New Roman" w:cs="Times New Roman"/>
+          <w:i/>
+          <w:iCs/>
+        </w:rPr>
+      </w:pPr>
+      <w:r>
+        <w:rPr>
+          <w:rFonts w:ascii="Times New Roman" w:eastAsia="Times New Roman" w:hAnsi="Times New Roman" w:cs="Times New Roman"/>
+          <w:i/>
+          <w:iCs/>
+        </w:rPr>
+        <w:t>Esta función recursiva tiene como objetivo calcular la suma de los kilogramos de todos los paquetes almacenados en el manifiesto.</w:t>
+      </w:r>
+    </w:p>
+    <w:p>
+      <w:pPr>
+        <w:jc w:val="both"/>
+        <w:rPr>
+          <w:rFonts w:ascii="Times New Roman" w:eastAsia="Times New Roman" w:hAnsi="Times New Roman" w:cs="Times New Roman"/>
+          <w:i/>
+          <w:iCs/>
+        </w:rPr>
+      </w:pPr>
+    </w:p>
+    <w:p>
+      <w:pPr>
+        <w:pStyle w:val="Prrafodelista"/>
+        <w:numPr>
+          <w:ilvl w:val="0"/>
+          <w:numId w:val="25"/>
+        </w:numPr>
+        <w:spacing w:after="100" w:afterAutospacing="1"/>
+        <w:jc w:val="both"/>
+        <w:rPr>
+          <w:rFonts w:ascii="Arial" w:eastAsia="Times New Roman" w:hAnsi="Arial" w:cs="Arial"/>
+        </w:rPr>
+      </w:pPr>
+      <w:r>
+        <w:rPr>
+          <w:rFonts w:ascii="Times New Roman" w:eastAsia="Times New Roman" w:hAnsi="Times New Roman" w:cs="Times New Roman"/>
+          <w:i/>
+          <w:iCs/>
+        </w:rPr>
+        <w:t>Caso Base: La recursión se detiene cuando la lista de paquetes está vacía (</w:t>
+      </w:r>
+      <w:proofErr w:type="spellStart"/>
+      <w:r>
+        <w:rPr>
+          <w:rFonts w:ascii="Times New Roman" w:eastAsia="Times New Roman" w:hAnsi="Times New Roman" w:cs="Times New Roman"/>
+          <w:i/>
+          <w:iCs/>
+        </w:rPr>
+        <w:t>if</w:t>
+      </w:r>
+      <w:proofErr w:type="spellEnd"/>
+      <w:r>
+        <w:rPr>
+          <w:rFonts w:ascii="Times New Roman" w:eastAsia="Times New Roman" w:hAnsi="Times New Roman" w:cs="Times New Roman"/>
+          <w:i/>
+          <w:iCs/>
+        </w:rPr>
+        <w:t xml:space="preserve"> </w:t>
+      </w:r>
+      <w:proofErr w:type="spellStart"/>
+      <w:r>
+        <w:rPr>
+          <w:rFonts w:ascii="Times New Roman" w:eastAsia="Times New Roman" w:hAnsi="Times New Roman" w:cs="Times New Roman"/>
+          <w:i/>
+          <w:iCs/>
+        </w:rPr>
+        <w:t>lista</w:t>
+      </w:r>
+      <w:r>
+        <w:rPr>
+          <w:rFonts w:ascii="Times New Roman" w:eastAsia="Times New Roman" w:hAnsi="Times New Roman" w:cs="Times New Roman"/>
+          <w:i/>
+          <w:iCs/>
+        </w:rPr>
+        <w:t>_</w:t>
+      </w:r>
+      <w:r>
+        <w:rPr>
+          <w:rFonts w:ascii="Times New Roman" w:eastAsia="Times New Roman" w:hAnsi="Times New Roman" w:cs="Times New Roman"/>
+          <w:i/>
+          <w:iCs/>
+        </w:rPr>
+        <w:t>paquetes</w:t>
+      </w:r>
+      <w:proofErr w:type="spellEnd"/>
+      <w:r>
+        <w:rPr>
+          <w:rFonts w:ascii="Times New Roman" w:eastAsia="Times New Roman" w:hAnsi="Times New Roman" w:cs="Times New Roman"/>
+          <w:i/>
+          <w:iCs/>
+        </w:rPr>
+        <w:t xml:space="preserve"> == []:). En este punto, no hay más paquetes que pesar, por lo que la función retorna 0.</w:t>
+      </w:r>
+      <w:r>
+        <w:t xml:space="preserve"> </w:t>
+      </w:r>
+    </w:p>
+    <w:p>
+      <w:pPr>
+        <w:pStyle w:val="Prrafodelista"/>
+        <w:numPr>
+          <w:ilvl w:val="0"/>
+          <w:numId w:val="25"/>
+        </w:numPr>
+        <w:spacing w:after="100" w:afterAutospacing="1"/>
+        <w:jc w:val="both"/>
+        <w:rPr>
+          <w:rFonts w:ascii="Arial" w:eastAsia="Times New Roman" w:hAnsi="Arial" w:cs="Arial"/>
+        </w:rPr>
+      </w:pPr>
+      <w:r>
+        <w:rPr>
+          <w:rFonts w:ascii="Times New Roman" w:eastAsia="Times New Roman" w:hAnsi="Times New Roman" w:cs="Times New Roman"/>
+          <w:i/>
+          <w:iCs/>
+        </w:rPr>
+        <w:t>Caso Recursivo: Mientras la lista contenga elementos, la función extrae el peso del primer paquete de la lista (</w:t>
+      </w:r>
+      <w:proofErr w:type="spellStart"/>
+      <w:r>
+        <w:rPr>
+          <w:rFonts w:ascii="Times New Roman" w:eastAsia="Times New Roman" w:hAnsi="Times New Roman" w:cs="Times New Roman"/>
+          <w:i/>
+          <w:iCs/>
+        </w:rPr>
+        <w:t>lista_</w:t>
+      </w:r>
+      <w:proofErr w:type="gramStart"/>
+      <w:r>
+        <w:rPr>
+          <w:rFonts w:ascii="Times New Roman" w:eastAsia="Times New Roman" w:hAnsi="Times New Roman" w:cs="Times New Roman"/>
+          <w:i/>
+          <w:iCs/>
+        </w:rPr>
+        <w:t>paquetes</w:t>
+      </w:r>
+      <w:proofErr w:type="spellEnd"/>
+      <w:r>
+        <w:rPr>
+          <w:rFonts w:ascii="Times New Roman" w:eastAsia="Times New Roman" w:hAnsi="Times New Roman" w:cs="Times New Roman"/>
+          <w:i/>
+          <w:iCs/>
+        </w:rPr>
+        <w:t>[</w:t>
+      </w:r>
+      <w:proofErr w:type="gramEnd"/>
+      <w:r>
+        <w:rPr>
+          <w:rFonts w:ascii="Times New Roman" w:eastAsia="Times New Roman" w:hAnsi="Times New Roman" w:cs="Times New Roman"/>
+          <w:i/>
+          <w:iCs/>
+        </w:rPr>
+        <w:t>0][1]) y lo suma al resultado de llamarse a sí misma pasándole el resto de la lista (calcular_peso_total(</w:t>
+      </w:r>
+      <w:proofErr w:type="spellStart"/>
+      <w:r>
+        <w:rPr>
+          <w:rFonts w:ascii="Times New Roman" w:eastAsia="Times New Roman" w:hAnsi="Times New Roman" w:cs="Times New Roman"/>
+          <w:i/>
+          <w:iCs/>
+        </w:rPr>
+        <w:t>lista_</w:t>
+      </w:r>
+      <w:proofErr w:type="gramStart"/>
+      <w:r>
+        <w:rPr>
+          <w:rFonts w:ascii="Times New Roman" w:eastAsia="Times New Roman" w:hAnsi="Times New Roman" w:cs="Times New Roman"/>
+          <w:i/>
+          <w:iCs/>
+        </w:rPr>
+        <w:t>paquetes</w:t>
+      </w:r>
+      <w:proofErr w:type="spellEnd"/>
+      <w:r>
+        <w:rPr>
+          <w:rFonts w:ascii="Times New Roman" w:eastAsia="Times New Roman" w:hAnsi="Times New Roman" w:cs="Times New Roman"/>
+          <w:i/>
+          <w:iCs/>
+        </w:rPr>
+        <w:t>[</w:t>
+      </w:r>
+      <w:proofErr w:type="gramEnd"/>
+      <w:r>
+        <w:rPr>
+          <w:rFonts w:ascii="Times New Roman" w:eastAsia="Times New Roman" w:hAnsi="Times New Roman" w:cs="Times New Roman"/>
+          <w:i/>
+          <w:iCs/>
+        </w:rPr>
+        <w:t>1:])).</w:t>
+      </w:r>
+    </w:p>
+    <w:p>
+      <w:pPr>
+        <w:spacing w:after="100" w:afterAutospacing="1"/>
+        <w:jc w:val="both"/>
+      </w:pPr>
+      <w:r>
+        <w:rPr>
+          <w:rFonts w:ascii="Times New Roman" w:eastAsia="Times New Roman" w:hAnsi="Times New Roman" w:cs="Times New Roman"/>
+          <w:i/>
+          <w:iCs/>
+        </w:rPr>
+        <w:t>Diagrama de Flujo / Traza de Llamadas (Ejemplo con 2 paquetes: 10kg y 5kg):</w:t>
+      </w:r>
+      <w:r>
+        <w:t xml:space="preserve"> </w:t>
+      </w:r>
+    </w:p>
+    <w:p>
+      <w:pPr>
+        <w:pStyle w:val="Prrafodelista"/>
+        <w:numPr>
+          <w:ilvl w:val="1"/>
+          <w:numId w:val="23"/>
+        </w:numPr>
+        <w:spacing w:after="100" w:afterAutospacing="1"/>
+        <w:jc w:val="both"/>
+        <w:rPr>
+          <w:rFonts w:ascii="Times New Roman" w:eastAsia="Times New Roman" w:hAnsi="Times New Roman" w:cs="Times New Roman"/>
+          <w:i/>
+          <w:iCs/>
+        </w:rPr>
+      </w:pPr>
+      <w:r>
+        <w:rPr>
+          <w:rFonts w:ascii="Times New Roman" w:eastAsia="Times New Roman" w:hAnsi="Times New Roman" w:cs="Times New Roman"/>
+          <w:i/>
+          <w:iCs/>
+        </w:rPr>
+        <w:t>calcular_peso_</w:t>
+      </w:r>
+      <w:proofErr w:type="gramStart"/>
+      <w:r>
+        <w:rPr>
+          <w:rFonts w:ascii="Times New Roman" w:eastAsia="Times New Roman" w:hAnsi="Times New Roman" w:cs="Times New Roman"/>
+          <w:i/>
+          <w:iCs/>
+        </w:rPr>
+        <w:t>total(</w:t>
+      </w:r>
+      <w:proofErr w:type="gramEnd"/>
+      <w:r>
+        <w:rPr>
+          <w:rFonts w:ascii="Times New Roman" w:eastAsia="Times New Roman" w:hAnsi="Times New Roman" w:cs="Times New Roman"/>
+          <w:i/>
+          <w:iCs/>
+        </w:rPr>
+        <w:t>[[A, 10, ...], [B, 5, ...]]) -&gt; Retorna 10 + calcular_peso_</w:t>
+      </w:r>
+      <w:proofErr w:type="gramStart"/>
+      <w:r>
+        <w:rPr>
+          <w:rFonts w:ascii="Times New Roman" w:eastAsia="Times New Roman" w:hAnsi="Times New Roman" w:cs="Times New Roman"/>
+          <w:i/>
+          <w:iCs/>
+        </w:rPr>
+        <w:t>total(</w:t>
+      </w:r>
+      <w:proofErr w:type="gramEnd"/>
+      <w:r>
+        <w:rPr>
+          <w:rFonts w:ascii="Times New Roman" w:eastAsia="Times New Roman" w:hAnsi="Times New Roman" w:cs="Times New Roman"/>
+          <w:i/>
+          <w:iCs/>
+        </w:rPr>
+        <w:t>[[B, 5, ...]]).</w:t>
+      </w:r>
+    </w:p>
+    <w:p>
+      <w:pPr>
+        <w:pStyle w:val="Prrafodelista"/>
+        <w:numPr>
+          <w:ilvl w:val="1"/>
+          <w:numId w:val="23"/>
+        </w:numPr>
+        <w:spacing w:after="100" w:afterAutospacing="1"/>
+        <w:jc w:val="both"/>
+        <w:rPr>
+          <w:rFonts w:ascii="Times New Roman" w:eastAsia="Times New Roman" w:hAnsi="Times New Roman" w:cs="Times New Roman"/>
+          <w:i/>
+          <w:iCs/>
+        </w:rPr>
+      </w:pPr>
+      <w:r>
+        <w:rPr>
+          <w:rFonts w:ascii="Times New Roman" w:eastAsia="Times New Roman" w:hAnsi="Times New Roman" w:cs="Times New Roman"/>
+          <w:i/>
+          <w:iCs/>
+        </w:rPr>
+        <w:t>calcular_peso_total([[B, 5, ...]]) -&gt; Retorna 5 + calcular_peso_</w:t>
+      </w:r>
+      <w:proofErr w:type="gramStart"/>
+      <w:r>
+        <w:rPr>
+          <w:rFonts w:ascii="Times New Roman" w:eastAsia="Times New Roman" w:hAnsi="Times New Roman" w:cs="Times New Roman"/>
+          <w:i/>
+          <w:iCs/>
+        </w:rPr>
+        <w:t>total(</w:t>
+      </w:r>
+      <w:proofErr w:type="gramEnd"/>
+      <w:r>
+        <w:rPr>
+          <w:rFonts w:ascii="Times New Roman" w:eastAsia="Times New Roman" w:hAnsi="Times New Roman" w:cs="Times New Roman"/>
+          <w:i/>
+          <w:iCs/>
+        </w:rPr>
+        <w:t>[]).</w:t>
+      </w:r>
+    </w:p>
+    <w:p>
+      <w:pPr>
+        <w:pStyle w:val="Prrafodelista"/>
+        <w:numPr>
+          <w:ilvl w:val="1"/>
+          <w:numId w:val="23"/>
+        </w:numPr>
+        <w:spacing w:after="100" w:afterAutospacing="1"/>
+        <w:jc w:val="both"/>
+        <w:rPr>
+          <w:rFonts w:ascii="Times New Roman" w:eastAsia="Times New Roman" w:hAnsi="Times New Roman" w:cs="Times New Roman"/>
+          <w:i/>
+          <w:iCs/>
+        </w:rPr>
+      </w:pPr>
+      <w:r>
+        <w:rPr>
+          <w:rFonts w:ascii="Times New Roman" w:eastAsia="Times New Roman" w:hAnsi="Times New Roman" w:cs="Times New Roman"/>
+          <w:i/>
+          <w:iCs/>
+        </w:rPr>
+        <w:t>calcular_peso_</w:t>
+      </w:r>
+      <w:proofErr w:type="gramStart"/>
+      <w:r>
+        <w:rPr>
+          <w:rFonts w:ascii="Times New Roman" w:eastAsia="Times New Roman" w:hAnsi="Times New Roman" w:cs="Times New Roman"/>
+          <w:i/>
+          <w:iCs/>
+        </w:rPr>
+        <w:t>total(</w:t>
+      </w:r>
+      <w:proofErr w:type="gramEnd"/>
+      <w:r>
+        <w:rPr>
+          <w:rFonts w:ascii="Times New Roman" w:eastAsia="Times New Roman" w:hAnsi="Times New Roman" w:cs="Times New Roman"/>
+          <w:i/>
+          <w:iCs/>
+        </w:rPr>
+        <w:t xml:space="preserve">[]) -&gt; Alcanza el caso base y retorna 0.  </w:t>
+      </w:r>
+    </w:p>
+    <w:p>
+      <w:pPr>
+        <w:pStyle w:val="Prrafodelista"/>
+        <w:numPr>
+          <w:ilvl w:val="1"/>
+          <w:numId w:val="23"/>
+        </w:numPr>
+        <w:spacing w:after="100" w:afterAutospacing="1"/>
+        <w:jc w:val="both"/>
+        <w:rPr>
+          <w:rFonts w:ascii="Times New Roman" w:eastAsia="Times New Roman" w:hAnsi="Times New Roman" w:cs="Times New Roman"/>
+          <w:i/>
+          <w:iCs/>
+        </w:rPr>
+      </w:pPr>
+      <w:proofErr w:type="spellStart"/>
+      <w:r>
+        <w:rPr>
+          <w:rFonts w:ascii="Times New Roman" w:eastAsia="Times New Roman" w:hAnsi="Times New Roman" w:cs="Times New Roman"/>
+          <w:i/>
+          <w:iCs/>
+        </w:rPr>
+        <w:t>Desapilado</w:t>
+      </w:r>
+      <w:proofErr w:type="spellEnd"/>
+      <w:r>
+        <w:rPr>
+          <w:rFonts w:ascii="Times New Roman" w:eastAsia="Times New Roman" w:hAnsi="Times New Roman" w:cs="Times New Roman"/>
+          <w:i/>
+          <w:iCs/>
+        </w:rPr>
+        <w:t xml:space="preserve">: 5 + 0 = 5 -&gt; 10 + 5 = 15. El peso total es 15 kg. </w:t>
+      </w:r>
+    </w:p>
+    <w:p>
+      <w:pPr>
+        <w:pStyle w:val="Prrafodelista"/>
+        <w:spacing w:after="100" w:afterAutospacing="1"/>
+        <w:ind w:left="1080"/>
+        <w:jc w:val="both"/>
+        <w:rPr>
+          <w:rFonts w:ascii="Times New Roman" w:eastAsia="Times New Roman" w:hAnsi="Times New Roman" w:cs="Times New Roman"/>
+          <w:i/>
+          <w:iCs/>
+        </w:rPr>
+      </w:pPr>
+    </w:p>
+    <w:p>
+      <w:pPr>
+        <w:pStyle w:val="Prrafodelista"/>
+        <w:numPr>
+          <w:ilvl w:val="0"/>
+          <w:numId w:val="23"/>
+        </w:numPr>
+        <w:spacing w:after="100" w:afterAutospacing="1"/>
+        <w:jc w:val="both"/>
+        <w:rPr>
+          <w:rFonts w:ascii="Times New Roman" w:eastAsia="Times New Roman" w:hAnsi="Times New Roman" w:cs="Times New Roman"/>
+          <w:i/>
+          <w:iCs/>
+        </w:rPr>
+      </w:pPr>
+      <w:r>
+        <w:rPr>
+          <w:rFonts w:ascii="Times New Roman" w:eastAsia="Times New Roman" w:hAnsi="Times New Roman" w:cs="Times New Roman"/>
+          <w:i/>
+          <w:iCs/>
+        </w:rPr>
+        <w:t xml:space="preserve">Función: </w:t>
+      </w:r>
+      <w:proofErr w:type="spellStart"/>
+      <w:r>
+        <w:rPr>
+          <w:rFonts w:ascii="Times New Roman" w:eastAsia="Times New Roman" w:hAnsi="Times New Roman" w:cs="Times New Roman"/>
+          <w:i/>
+          <w:iCs/>
+        </w:rPr>
+        <w:t>contar_paquetes_fragiles</w:t>
+      </w:r>
+      <w:proofErr w:type="spellEnd"/>
+      <w:r>
+        <w:rPr>
+          <w:rFonts w:ascii="Times New Roman" w:eastAsia="Times New Roman" w:hAnsi="Times New Roman" w:cs="Times New Roman"/>
+          <w:i/>
+          <w:iCs/>
+        </w:rPr>
+        <w:t>(</w:t>
+      </w:r>
+      <w:proofErr w:type="spellStart"/>
+      <w:r>
+        <w:rPr>
+          <w:rFonts w:ascii="Times New Roman" w:eastAsia="Times New Roman" w:hAnsi="Times New Roman" w:cs="Times New Roman"/>
+          <w:i/>
+          <w:iCs/>
+        </w:rPr>
+        <w:t>lista_paquetes</w:t>
+      </w:r>
+      <w:proofErr w:type="spellEnd"/>
+      <w:r>
+        <w:rPr>
+          <w:rFonts w:ascii="Times New Roman" w:eastAsia="Times New Roman" w:hAnsi="Times New Roman" w:cs="Times New Roman"/>
+          <w:i/>
+          <w:iCs/>
+        </w:rPr>
+        <w:t>)</w:t>
+      </w:r>
+    </w:p>
+    <w:p>
+      <w:pPr>
+        <w:pStyle w:val="Prrafodelista"/>
+        <w:spacing w:after="100" w:afterAutospacing="1"/>
+        <w:ind w:left="360"/>
+        <w:jc w:val="both"/>
+        <w:rPr>
+          <w:rFonts w:ascii="Times New Roman" w:eastAsia="Times New Roman" w:hAnsi="Times New Roman" w:cs="Times New Roman"/>
+          <w:i/>
+          <w:iCs/>
+        </w:rPr>
+      </w:pPr>
+    </w:p>
+    <w:p>
+      <w:pPr>
+        <w:pStyle w:val="Prrafodelista"/>
+        <w:spacing w:after="100" w:afterAutospacing="1"/>
+        <w:ind w:left="360"/>
+        <w:jc w:val="both"/>
+        <w:rPr>
+          <w:rFonts w:ascii="Times New Roman" w:eastAsia="Times New Roman" w:hAnsi="Times New Roman" w:cs="Times New Roman"/>
+          <w:i/>
+          <w:iCs/>
+        </w:rPr>
+      </w:pPr>
+      <w:r>
+        <w:rPr>
+          <w:rFonts w:ascii="Times New Roman" w:eastAsia="Times New Roman" w:hAnsi="Times New Roman" w:cs="Times New Roman"/>
+          <w:i/>
+          <w:iCs/>
+        </w:rPr>
+        <w:t>Esta función recursiva retorna la cantidad de paquetes registrados que requieren manipulación frágil.</w:t>
+      </w:r>
+    </w:p>
+    <w:p>
+      <w:pPr>
+        <w:pStyle w:val="Prrafodelista"/>
+        <w:spacing w:after="100" w:afterAutospacing="1"/>
+        <w:ind w:left="360"/>
+        <w:jc w:val="both"/>
+        <w:rPr>
+          <w:rFonts w:ascii="Times New Roman" w:eastAsia="Times New Roman" w:hAnsi="Times New Roman" w:cs="Times New Roman"/>
+          <w:i/>
+          <w:iCs/>
+        </w:rPr>
+      </w:pPr>
+    </w:p>
+    <w:p>
+      <w:pPr>
+        <w:pStyle w:val="Prrafodelista"/>
+        <w:numPr>
+          <w:ilvl w:val="0"/>
+          <w:numId w:val="27"/>
+        </w:numPr>
+        <w:spacing w:after="100" w:afterAutospacing="1"/>
+        <w:jc w:val="both"/>
+        <w:rPr>
+          <w:rFonts w:ascii="Times New Roman" w:eastAsia="Times New Roman" w:hAnsi="Times New Roman" w:cs="Times New Roman"/>
+          <w:i/>
+          <w:iCs/>
+        </w:rPr>
+      </w:pPr>
+      <w:r>
+        <w:rPr>
+          <w:rFonts w:ascii="Times New Roman" w:eastAsia="Times New Roman" w:hAnsi="Times New Roman" w:cs="Times New Roman"/>
+          <w:i/>
+          <w:iCs/>
+        </w:rPr>
+        <w:t>Caso Base: Al igual que en la función anterior, si la lista de paquetes está vacía (</w:t>
+      </w:r>
+      <w:proofErr w:type="spellStart"/>
+      <w:r>
+        <w:rPr>
+          <w:rFonts w:ascii="Times New Roman" w:eastAsia="Times New Roman" w:hAnsi="Times New Roman" w:cs="Times New Roman"/>
+          <w:i/>
+          <w:iCs/>
+        </w:rPr>
+        <w:t>if</w:t>
+      </w:r>
+      <w:proofErr w:type="spellEnd"/>
+      <w:r>
+        <w:rPr>
+          <w:rFonts w:ascii="Times New Roman" w:eastAsia="Times New Roman" w:hAnsi="Times New Roman" w:cs="Times New Roman"/>
+          <w:i/>
+          <w:iCs/>
+        </w:rPr>
+        <w:t xml:space="preserve"> </w:t>
+      </w:r>
+      <w:proofErr w:type="spellStart"/>
+      <w:r>
+        <w:rPr>
+          <w:rFonts w:ascii="Times New Roman" w:eastAsia="Times New Roman" w:hAnsi="Times New Roman" w:cs="Times New Roman"/>
+          <w:i/>
+          <w:iCs/>
+        </w:rPr>
+        <w:t>lista_paquetes</w:t>
+      </w:r>
+      <w:proofErr w:type="spellEnd"/>
+      <w:r>
+        <w:rPr>
+          <w:rFonts w:ascii="Times New Roman" w:eastAsia="Times New Roman" w:hAnsi="Times New Roman" w:cs="Times New Roman"/>
+          <w:i/>
+          <w:iCs/>
+        </w:rPr>
+        <w:t xml:space="preserve"> == []:), la función retorna 0 indicando que no hay paquetes frágiles por contar.  </w:t>
+      </w:r>
+    </w:p>
+    <w:p>
+      <w:pPr>
+        <w:pStyle w:val="Prrafodelista"/>
+        <w:numPr>
+          <w:ilvl w:val="0"/>
+          <w:numId w:val="27"/>
+        </w:numPr>
+        <w:spacing w:after="100" w:afterAutospacing="1"/>
+        <w:jc w:val="both"/>
+        <w:rPr>
+          <w:rFonts w:ascii="Times New Roman" w:eastAsia="Times New Roman" w:hAnsi="Times New Roman" w:cs="Times New Roman"/>
+          <w:i/>
+          <w:iCs/>
+        </w:rPr>
+      </w:pPr>
+      <w:r>
+        <w:rPr>
+          <w:rFonts w:ascii="Times New Roman" w:eastAsia="Times New Roman" w:hAnsi="Times New Roman" w:cs="Times New Roman"/>
+          <w:i/>
+          <w:iCs/>
+        </w:rPr>
+        <w:t>Casos Recursivos:</w:t>
+      </w:r>
+    </w:p>
+    <w:p>
+      <w:pPr>
+        <w:pStyle w:val="Prrafodelista"/>
+        <w:numPr>
+          <w:ilvl w:val="1"/>
+          <w:numId w:val="27"/>
+        </w:numPr>
+        <w:spacing w:after="100" w:afterAutospacing="1"/>
+        <w:jc w:val="both"/>
+        <w:rPr>
+          <w:rFonts w:ascii="Times New Roman" w:eastAsia="Times New Roman" w:hAnsi="Times New Roman" w:cs="Times New Roman"/>
+          <w:i/>
+          <w:iCs/>
+        </w:rPr>
+      </w:pPr>
+      <w:r>
+        <w:rPr>
+          <w:rFonts w:ascii="Times New Roman" w:eastAsia="Times New Roman" w:hAnsi="Times New Roman" w:cs="Times New Roman"/>
+          <w:i/>
+          <w:iCs/>
+        </w:rPr>
+        <w:t>Si es frágil: Si el atributo de fragilidad del primer paquete es verdadero (</w:t>
+      </w:r>
+      <w:proofErr w:type="spellStart"/>
+      <w:r>
+        <w:rPr>
+          <w:rFonts w:ascii="Times New Roman" w:eastAsia="Times New Roman" w:hAnsi="Times New Roman" w:cs="Times New Roman"/>
+          <w:i/>
+          <w:iCs/>
+        </w:rPr>
+        <w:t>if</w:t>
+      </w:r>
+      <w:proofErr w:type="spellEnd"/>
+      <w:r>
+        <w:rPr>
+          <w:rFonts w:ascii="Times New Roman" w:eastAsia="Times New Roman" w:hAnsi="Times New Roman" w:cs="Times New Roman"/>
+          <w:i/>
+          <w:iCs/>
+        </w:rPr>
+        <w:t xml:space="preserve"> </w:t>
+      </w:r>
+      <w:proofErr w:type="spellStart"/>
+      <w:r>
+        <w:rPr>
+          <w:rFonts w:ascii="Times New Roman" w:eastAsia="Times New Roman" w:hAnsi="Times New Roman" w:cs="Times New Roman"/>
+          <w:i/>
+          <w:iCs/>
+        </w:rPr>
+        <w:t>lista_</w:t>
+      </w:r>
+      <w:proofErr w:type="gramStart"/>
+      <w:r>
+        <w:rPr>
+          <w:rFonts w:ascii="Times New Roman" w:eastAsia="Times New Roman" w:hAnsi="Times New Roman" w:cs="Times New Roman"/>
+          <w:i/>
+          <w:iCs/>
+        </w:rPr>
+        <w:t>paquetes</w:t>
+      </w:r>
+      <w:proofErr w:type="spellEnd"/>
+      <w:r>
+        <w:rPr>
+          <w:rFonts w:ascii="Times New Roman" w:eastAsia="Times New Roman" w:hAnsi="Times New Roman" w:cs="Times New Roman"/>
+          <w:i/>
+          <w:iCs/>
+        </w:rPr>
+        <w:t>[</w:t>
+      </w:r>
+      <w:proofErr w:type="gramEnd"/>
+      <w:r>
+        <w:rPr>
+          <w:rFonts w:ascii="Times New Roman" w:eastAsia="Times New Roman" w:hAnsi="Times New Roman" w:cs="Times New Roman"/>
+          <w:i/>
+          <w:iCs/>
+        </w:rPr>
+        <w:t>0][3]:), la función suma 1 y hace el llamado recursivo con el resto de la lista (1 +</w:t>
+      </w:r>
+      <w:r>
+        <w:rPr>
+          <w:rFonts w:ascii="Times New Roman" w:eastAsia="Times New Roman" w:hAnsi="Times New Roman" w:cs="Times New Roman"/>
+          <w:i/>
+          <w:iCs/>
+        </w:rPr>
+        <w:t xml:space="preserve"> </w:t>
+      </w:r>
+      <w:proofErr w:type="spellStart"/>
+      <w:r>
+        <w:rPr>
+          <w:rFonts w:ascii="Times New Roman" w:eastAsia="Times New Roman" w:hAnsi="Times New Roman" w:cs="Times New Roman"/>
+          <w:i/>
+          <w:iCs/>
+        </w:rPr>
+        <w:t>contar_paquetes_fragiles</w:t>
+      </w:r>
+      <w:proofErr w:type="spellEnd"/>
+      <w:r>
+        <w:rPr>
+          <w:rFonts w:ascii="Times New Roman" w:eastAsia="Times New Roman" w:hAnsi="Times New Roman" w:cs="Times New Roman"/>
+          <w:i/>
+          <w:iCs/>
+        </w:rPr>
+        <w:t>(</w:t>
+      </w:r>
+      <w:proofErr w:type="spellStart"/>
+      <w:r>
+        <w:rPr>
+          <w:rFonts w:ascii="Times New Roman" w:eastAsia="Times New Roman" w:hAnsi="Times New Roman" w:cs="Times New Roman"/>
+          <w:i/>
+          <w:iCs/>
+        </w:rPr>
+        <w:t>lista_</w:t>
+      </w:r>
+      <w:proofErr w:type="gramStart"/>
+      <w:r>
+        <w:rPr>
+          <w:rFonts w:ascii="Times New Roman" w:eastAsia="Times New Roman" w:hAnsi="Times New Roman" w:cs="Times New Roman"/>
+          <w:i/>
+          <w:iCs/>
+        </w:rPr>
+        <w:t>paquetes</w:t>
+      </w:r>
+      <w:proofErr w:type="spellEnd"/>
+      <w:r>
+        <w:rPr>
+          <w:rFonts w:ascii="Times New Roman" w:eastAsia="Times New Roman" w:hAnsi="Times New Roman" w:cs="Times New Roman"/>
+          <w:i/>
+          <w:iCs/>
+        </w:rPr>
+        <w:t>[</w:t>
+      </w:r>
+      <w:proofErr w:type="gramEnd"/>
+      <w:r>
+        <w:rPr>
+          <w:rFonts w:ascii="Times New Roman" w:eastAsia="Times New Roman" w:hAnsi="Times New Roman" w:cs="Times New Roman"/>
+          <w:i/>
+          <w:iCs/>
+        </w:rPr>
+        <w:t>1:])).</w:t>
+      </w:r>
+      <w:r>
+        <w:rPr>
+          <w:rFonts w:ascii="Times New Roman" w:eastAsia="Times New Roman" w:hAnsi="Times New Roman" w:cs="Times New Roman"/>
+          <w:i/>
+          <w:iCs/>
+        </w:rPr>
+        <w:t>\</w:t>
+      </w:r>
+    </w:p>
+    <w:p>
+      <w:pPr>
+        <w:pStyle w:val="Prrafodelista"/>
+        <w:numPr>
+          <w:ilvl w:val="1"/>
+          <w:numId w:val="27"/>
+        </w:numPr>
+        <w:spacing w:after="100" w:afterAutospacing="1"/>
+        <w:jc w:val="both"/>
+        <w:rPr>
+          <w:rFonts w:ascii="Times New Roman" w:eastAsia="Times New Roman" w:hAnsi="Times New Roman" w:cs="Times New Roman"/>
+          <w:i/>
+          <w:iCs/>
+        </w:rPr>
+      </w:pPr>
+      <w:r>
+        <w:rPr>
+          <w:rFonts w:ascii="Times New Roman" w:eastAsia="Times New Roman" w:hAnsi="Times New Roman" w:cs="Times New Roman"/>
+          <w:b/>
+          <w:bCs/>
+          <w:i/>
+          <w:iCs/>
+        </w:rPr>
+        <w:lastRenderedPageBreak/>
+        <w:t>Si NO es frágil:</w:t>
+      </w:r>
+      <w:r>
+        <w:rPr>
+          <w:rFonts w:ascii="Times New Roman" w:eastAsia="Times New Roman" w:hAnsi="Times New Roman" w:cs="Times New Roman"/>
+          <w:i/>
+          <w:iCs/>
+        </w:rPr>
+        <w:t xml:space="preserve"> Si el paquete no es frágil, la función no suma nada y simplemente continúa la evaluación con el resto de la lista (</w:t>
+      </w:r>
+      <w:proofErr w:type="spellStart"/>
+      <w:r>
+        <w:rPr>
+          <w:rFonts w:ascii="Times New Roman" w:eastAsia="Times New Roman" w:hAnsi="Times New Roman" w:cs="Times New Roman"/>
+          <w:i/>
+          <w:iCs/>
+        </w:rPr>
+        <w:t>contar_paquetes_fragiles</w:t>
+      </w:r>
+      <w:proofErr w:type="spellEnd"/>
+      <w:r>
+        <w:rPr>
+          <w:rFonts w:ascii="Times New Roman" w:eastAsia="Times New Roman" w:hAnsi="Times New Roman" w:cs="Times New Roman"/>
+          <w:i/>
+          <w:iCs/>
+        </w:rPr>
+        <w:t>(</w:t>
+      </w:r>
+      <w:proofErr w:type="spellStart"/>
+      <w:r>
+        <w:rPr>
+          <w:rFonts w:ascii="Times New Roman" w:eastAsia="Times New Roman" w:hAnsi="Times New Roman" w:cs="Times New Roman"/>
+          <w:i/>
+          <w:iCs/>
+        </w:rPr>
+        <w:t>lista_</w:t>
+      </w:r>
+      <w:proofErr w:type="gramStart"/>
+      <w:r>
+        <w:rPr>
+          <w:rFonts w:ascii="Times New Roman" w:eastAsia="Times New Roman" w:hAnsi="Times New Roman" w:cs="Times New Roman"/>
+          <w:i/>
+          <w:iCs/>
+        </w:rPr>
+        <w:t>paquetes</w:t>
+      </w:r>
+      <w:proofErr w:type="spellEnd"/>
+      <w:r>
+        <w:rPr>
+          <w:rFonts w:ascii="Times New Roman" w:eastAsia="Times New Roman" w:hAnsi="Times New Roman" w:cs="Times New Roman"/>
+          <w:i/>
+          <w:iCs/>
+        </w:rPr>
+        <w:t>[</w:t>
+      </w:r>
+      <w:proofErr w:type="gramEnd"/>
+      <w:r>
+        <w:rPr>
+          <w:rFonts w:ascii="Times New Roman" w:eastAsia="Times New Roman" w:hAnsi="Times New Roman" w:cs="Times New Roman"/>
+          <w:i/>
+          <w:iCs/>
+        </w:rPr>
+        <w:t>1:])).</w:t>
+      </w:r>
+    </w:p>
+    <w:p>
+      <w:pPr>
+        <w:spacing w:after="100" w:afterAutospacing="1"/>
+        <w:jc w:val="both"/>
+        <w:rPr>
+          <w:rFonts w:ascii="Times New Roman" w:eastAsia="Times New Roman" w:hAnsi="Times New Roman" w:cs="Times New Roman"/>
+          <w:i/>
+          <w:iCs/>
+        </w:rPr>
+      </w:pPr>
+      <w:r>
+        <w:rPr>
+          <w:rFonts w:ascii="Times New Roman" w:eastAsia="Times New Roman" w:hAnsi="Times New Roman" w:cs="Times New Roman"/>
+          <w:i/>
+          <w:iCs/>
+        </w:rPr>
+        <w:t>Diagrama de Flujo / Traza de Llamadas (</w:t>
+      </w:r>
+      <w:proofErr w:type="spellStart"/>
+      <w:r>
+        <w:rPr>
+          <w:rFonts w:ascii="Times New Roman" w:eastAsia="Times New Roman" w:hAnsi="Times New Roman" w:cs="Times New Roman"/>
+          <w:i/>
+          <w:iCs/>
+        </w:rPr>
+        <w:t>contar_paquetes_fragiles</w:t>
+      </w:r>
+      <w:proofErr w:type="spellEnd"/>
+      <w:r>
+        <w:rPr>
+          <w:rFonts w:ascii="Times New Roman" w:eastAsia="Times New Roman" w:hAnsi="Times New Roman" w:cs="Times New Roman"/>
+          <w:i/>
+          <w:iCs/>
+        </w:rPr>
+        <w:t>) (Ejemplo con P1 frágil y P2 normal):</w:t>
+      </w:r>
+    </w:p>
+    <w:p>
+      <w:pPr>
+        <w:numPr>
+          <w:ilvl w:val="0"/>
+          <w:numId w:val="29"/>
+        </w:numPr>
+        <w:spacing w:after="100" w:afterAutospacing="1"/>
+        <w:jc w:val="both"/>
+        <w:rPr>
+          <w:rFonts w:ascii="Times New Roman" w:eastAsia="Times New Roman" w:hAnsi="Times New Roman" w:cs="Times New Roman"/>
+          <w:i/>
+          <w:iCs/>
+        </w:rPr>
+      </w:pPr>
+      <w:proofErr w:type="spellStart"/>
+      <w:r>
+        <w:rPr>
+          <w:rFonts w:ascii="Times New Roman" w:eastAsia="Times New Roman" w:hAnsi="Times New Roman" w:cs="Times New Roman"/>
+          <w:i/>
+          <w:iCs/>
+        </w:rPr>
+        <w:t>contar_paquetes_fragiles</w:t>
+      </w:r>
+      <w:proofErr w:type="spellEnd"/>
+      <w:r>
+        <w:rPr>
+          <w:rFonts w:ascii="Times New Roman" w:eastAsia="Times New Roman" w:hAnsi="Times New Roman" w:cs="Times New Roman"/>
+          <w:i/>
+          <w:iCs/>
+        </w:rPr>
+        <w:t xml:space="preserve">([P1(frágil), P2(normal)]) -&gt; Es frágil, retorna 1 + </w:t>
+      </w:r>
+      <w:proofErr w:type="spellStart"/>
+      <w:r>
+        <w:rPr>
+          <w:rFonts w:ascii="Times New Roman" w:eastAsia="Times New Roman" w:hAnsi="Times New Roman" w:cs="Times New Roman"/>
+          <w:i/>
+          <w:iCs/>
+        </w:rPr>
+        <w:t>contar_paquetes_fragiles</w:t>
+      </w:r>
+      <w:proofErr w:type="spellEnd"/>
+      <w:r>
+        <w:rPr>
+          <w:rFonts w:ascii="Times New Roman" w:eastAsia="Times New Roman" w:hAnsi="Times New Roman" w:cs="Times New Roman"/>
+          <w:i/>
+          <w:iCs/>
+        </w:rPr>
+        <w:t xml:space="preserve">([P2(normal)]). </w:t>
+      </w:r>
+    </w:p>
+    <w:p>
+      <w:pPr>
+        <w:numPr>
+          <w:ilvl w:val="0"/>
+          <w:numId w:val="29"/>
+        </w:numPr>
+        <w:spacing w:after="100" w:afterAutospacing="1"/>
+        <w:jc w:val="both"/>
+        <w:rPr>
+          <w:rFonts w:ascii="Times New Roman" w:eastAsia="Times New Roman" w:hAnsi="Times New Roman" w:cs="Times New Roman"/>
+          <w:i/>
+          <w:iCs/>
+        </w:rPr>
+      </w:pPr>
+      <w:proofErr w:type="spellStart"/>
+      <w:r>
+        <w:rPr>
+          <w:rFonts w:ascii="Times New Roman" w:eastAsia="Times New Roman" w:hAnsi="Times New Roman" w:cs="Times New Roman"/>
+          <w:i/>
+          <w:iCs/>
+        </w:rPr>
+        <w:t>contar_paquetes_fragiles</w:t>
+      </w:r>
+      <w:proofErr w:type="spellEnd"/>
+      <w:r>
+        <w:rPr>
+          <w:rFonts w:ascii="Times New Roman" w:eastAsia="Times New Roman" w:hAnsi="Times New Roman" w:cs="Times New Roman"/>
+          <w:i/>
+          <w:iCs/>
+        </w:rPr>
+        <w:t xml:space="preserve">([P2(normal)]) -&gt; No es frágil, retorna </w:t>
+      </w:r>
+      <w:proofErr w:type="spellStart"/>
+      <w:r>
+        <w:rPr>
+          <w:rFonts w:ascii="Times New Roman" w:eastAsia="Times New Roman" w:hAnsi="Times New Roman" w:cs="Times New Roman"/>
+          <w:i/>
+          <w:iCs/>
+        </w:rPr>
+        <w:t>contar_paquetes_</w:t>
+      </w:r>
+      <w:proofErr w:type="gramStart"/>
+      <w:r>
+        <w:rPr>
+          <w:rFonts w:ascii="Times New Roman" w:eastAsia="Times New Roman" w:hAnsi="Times New Roman" w:cs="Times New Roman"/>
+          <w:i/>
+          <w:iCs/>
+        </w:rPr>
+        <w:t>fragiles</w:t>
+      </w:r>
+      <w:proofErr w:type="spellEnd"/>
+      <w:r>
+        <w:rPr>
+          <w:rFonts w:ascii="Times New Roman" w:eastAsia="Times New Roman" w:hAnsi="Times New Roman" w:cs="Times New Roman"/>
+          <w:i/>
+          <w:iCs/>
+        </w:rPr>
+        <w:t>(</w:t>
+      </w:r>
+      <w:proofErr w:type="gramEnd"/>
+      <w:r>
+        <w:rPr>
+          <w:rFonts w:ascii="Times New Roman" w:eastAsia="Times New Roman" w:hAnsi="Times New Roman" w:cs="Times New Roman"/>
+          <w:i/>
+          <w:iCs/>
+        </w:rPr>
+        <w:t xml:space="preserve">[]). </w:t>
+      </w:r>
+    </w:p>
+    <w:p>
+      <w:pPr>
+        <w:numPr>
+          <w:ilvl w:val="0"/>
+          <w:numId w:val="29"/>
+        </w:numPr>
+        <w:spacing w:after="100" w:afterAutospacing="1"/>
+        <w:jc w:val="both"/>
+        <w:rPr>
+          <w:rFonts w:ascii="Times New Roman" w:eastAsia="Times New Roman" w:hAnsi="Times New Roman" w:cs="Times New Roman"/>
+          <w:i/>
+          <w:iCs/>
+        </w:rPr>
+      </w:pPr>
+      <w:proofErr w:type="spellStart"/>
+      <w:r>
+        <w:rPr>
+          <w:rFonts w:ascii="Times New Roman" w:eastAsia="Times New Roman" w:hAnsi="Times New Roman" w:cs="Times New Roman"/>
+          <w:i/>
+          <w:iCs/>
+        </w:rPr>
+        <w:t>contar_paquetes_</w:t>
+      </w:r>
+      <w:proofErr w:type="gramStart"/>
+      <w:r>
+        <w:rPr>
+          <w:rFonts w:ascii="Times New Roman" w:eastAsia="Times New Roman" w:hAnsi="Times New Roman" w:cs="Times New Roman"/>
+          <w:i/>
+          <w:iCs/>
+        </w:rPr>
+        <w:t>fragiles</w:t>
+      </w:r>
+      <w:proofErr w:type="spellEnd"/>
+      <w:r>
+        <w:rPr>
+          <w:rFonts w:ascii="Times New Roman" w:eastAsia="Times New Roman" w:hAnsi="Times New Roman" w:cs="Times New Roman"/>
+          <w:i/>
+          <w:iCs/>
+        </w:rPr>
+        <w:t>(</w:t>
+      </w:r>
+      <w:proofErr w:type="gramEnd"/>
+      <w:r>
+        <w:rPr>
+          <w:rFonts w:ascii="Times New Roman" w:eastAsia="Times New Roman" w:hAnsi="Times New Roman" w:cs="Times New Roman"/>
+          <w:i/>
+          <w:iCs/>
+        </w:rPr>
+        <w:t xml:space="preserve">[]) -&gt; Caso base, retorna 0. </w:t>
+      </w:r>
+    </w:p>
+    <w:p>
+      <w:pPr>
+        <w:numPr>
+          <w:ilvl w:val="0"/>
+          <w:numId w:val="29"/>
+        </w:numPr>
+        <w:spacing w:after="100" w:afterAutospacing="1"/>
+        <w:jc w:val="both"/>
+        <w:rPr>
+          <w:rFonts w:ascii="Times New Roman" w:eastAsia="Times New Roman" w:hAnsi="Times New Roman" w:cs="Times New Roman"/>
+          <w:i/>
+          <w:iCs/>
+        </w:rPr>
+      </w:pPr>
+      <w:proofErr w:type="spellStart"/>
+      <w:r>
+        <w:rPr>
+          <w:rFonts w:ascii="Times New Roman" w:eastAsia="Times New Roman" w:hAnsi="Times New Roman" w:cs="Times New Roman"/>
+          <w:i/>
+          <w:iCs/>
+        </w:rPr>
+        <w:t>Desapilado</w:t>
+      </w:r>
+      <w:proofErr w:type="spellEnd"/>
+      <w:r>
+        <w:rPr>
+          <w:rFonts w:ascii="Times New Roman" w:eastAsia="Times New Roman" w:hAnsi="Times New Roman" w:cs="Times New Roman"/>
+          <w:b/>
+          <w:bCs/>
+          <w:i/>
+          <w:iCs/>
+        </w:rPr>
+        <w:t>:</w:t>
+      </w:r>
+      <w:r>
+        <w:rPr>
+          <w:rFonts w:ascii="Times New Roman" w:eastAsia="Times New Roman" w:hAnsi="Times New Roman" w:cs="Times New Roman"/>
+          <w:i/>
+          <w:iCs/>
+        </w:rPr>
+        <w:t xml:space="preserve"> 0 -&gt; 1 + 0 = 1. </w:t>
+      </w:r>
+      <w:proofErr w:type="gramStart"/>
+      <w:r>
+        <w:rPr>
+          <w:rFonts w:ascii="Times New Roman" w:eastAsia="Times New Roman" w:hAnsi="Times New Roman" w:cs="Times New Roman"/>
+          <w:i/>
+          <w:iCs/>
+        </w:rPr>
+        <w:t>Total</w:t>
+      </w:r>
+      <w:proofErr w:type="gramEnd"/>
+      <w:r>
+        <w:rPr>
+          <w:rFonts w:ascii="Times New Roman" w:eastAsia="Times New Roman" w:hAnsi="Times New Roman" w:cs="Times New Roman"/>
+          <w:i/>
+          <w:iCs/>
+        </w:rPr>
+        <w:t xml:space="preserve"> frágiles: 1</w:t>
+      </w:r>
+      <w:r>
+        <w:rPr>
+          <w:rFonts w:ascii="Times New Roman" w:eastAsia="Times New Roman" w:hAnsi="Times New Roman" w:cs="Times New Roman"/>
+          <w:i/>
+          <w:iCs/>
+        </w:rPr>
+        <w:t>.</w:t>
+      </w:r>
+    </w:p>
+    <w:p>
+      <w:pPr>
+        <w:pStyle w:val="Prrafodelista"/>
+        <w:numPr>
+          <w:ilvl w:val="0"/>
+          <w:numId w:val="23"/>
+        </w:numPr>
+        <w:spacing w:after="100" w:afterAutospacing="1"/>
+        <w:jc w:val="both"/>
+        <w:rPr>
+          <w:rFonts w:ascii="Times New Roman" w:eastAsia="Times New Roman" w:hAnsi="Times New Roman" w:cs="Times New Roman"/>
+          <w:i/>
+          <w:iCs/>
+        </w:rPr>
+      </w:pPr>
+      <w:r>
+        <w:rPr>
+          <w:rFonts w:ascii="Times New Roman" w:eastAsia="Times New Roman" w:hAnsi="Times New Roman" w:cs="Times New Roman"/>
+          <w:i/>
+          <w:iCs/>
+        </w:rPr>
+        <w:t xml:space="preserve">Función: </w:t>
+      </w:r>
+      <w:proofErr w:type="spellStart"/>
+      <w:r>
+        <w:rPr>
+          <w:rFonts w:ascii="Times New Roman" w:eastAsia="Times New Roman" w:hAnsi="Times New Roman" w:cs="Times New Roman"/>
+          <w:i/>
+          <w:iCs/>
+        </w:rPr>
+        <w:t>obtener_paquetes_</w:t>
+      </w:r>
+      <w:proofErr w:type="gramStart"/>
+      <w:r>
+        <w:rPr>
+          <w:rFonts w:ascii="Times New Roman" w:eastAsia="Times New Roman" w:hAnsi="Times New Roman" w:cs="Times New Roman"/>
+          <w:i/>
+          <w:iCs/>
+        </w:rPr>
+        <w:t>sobrepeso</w:t>
+      </w:r>
+      <w:proofErr w:type="spellEnd"/>
+      <w:r>
+        <w:rPr>
+          <w:rFonts w:ascii="Times New Roman" w:eastAsia="Times New Roman" w:hAnsi="Times New Roman" w:cs="Times New Roman"/>
+          <w:i/>
+          <w:iCs/>
+        </w:rPr>
+        <w:t>(</w:t>
+      </w:r>
+      <w:proofErr w:type="spellStart"/>
+      <w:proofErr w:type="gramEnd"/>
+      <w:r>
+        <w:rPr>
+          <w:rFonts w:ascii="Times New Roman" w:eastAsia="Times New Roman" w:hAnsi="Times New Roman" w:cs="Times New Roman"/>
+          <w:i/>
+          <w:iCs/>
+        </w:rPr>
+        <w:t>lista_paquetes</w:t>
+      </w:r>
+      <w:proofErr w:type="spellEnd"/>
+      <w:r>
+        <w:rPr>
+          <w:rFonts w:ascii="Times New Roman" w:eastAsia="Times New Roman" w:hAnsi="Times New Roman" w:cs="Times New Roman"/>
+          <w:i/>
+          <w:iCs/>
+        </w:rPr>
+        <w:t xml:space="preserve">, </w:t>
+      </w:r>
+      <w:proofErr w:type="spellStart"/>
+      <w:r>
+        <w:rPr>
+          <w:rFonts w:ascii="Times New Roman" w:eastAsia="Times New Roman" w:hAnsi="Times New Roman" w:cs="Times New Roman"/>
+          <w:i/>
+          <w:iCs/>
+        </w:rPr>
+        <w:t>peso_limite</w:t>
+      </w:r>
+      <w:proofErr w:type="spellEnd"/>
+      <w:r>
+        <w:rPr>
+          <w:rFonts w:ascii="Times New Roman" w:eastAsia="Times New Roman" w:hAnsi="Times New Roman" w:cs="Times New Roman"/>
+          <w:i/>
+          <w:iCs/>
+        </w:rPr>
+        <w:t>)</w:t>
+      </w:r>
+    </w:p>
+    <w:p>
+      <w:pPr>
+        <w:spacing w:after="100" w:afterAutospacing="1"/>
+        <w:jc w:val="both"/>
+        <w:rPr>
+          <w:rFonts w:ascii="Times New Roman" w:eastAsia="Times New Roman" w:hAnsi="Times New Roman" w:cs="Times New Roman"/>
+          <w:i/>
+          <w:iCs/>
+        </w:rPr>
+      </w:pPr>
+      <w:r>
+        <w:rPr>
+          <w:rFonts w:ascii="Times New Roman" w:eastAsia="Times New Roman" w:hAnsi="Times New Roman" w:cs="Times New Roman"/>
+          <w:i/>
+          <w:iCs/>
+        </w:rPr>
+        <w:t>Esta función recursiva genera una nueva lista con los códigos de los paquetes cuyo peso supera un valor límite indicado por el usuario.</w:t>
+      </w:r>
+    </w:p>
+    <w:p>
+      <w:pPr>
+        <w:pStyle w:val="Prrafodelista"/>
+        <w:numPr>
+          <w:ilvl w:val="0"/>
+          <w:numId w:val="30"/>
+        </w:numPr>
+        <w:spacing w:after="100" w:afterAutospacing="1"/>
+        <w:jc w:val="both"/>
+        <w:rPr>
+          <w:rFonts w:ascii="Times New Roman" w:eastAsia="Times New Roman" w:hAnsi="Times New Roman" w:cs="Times New Roman"/>
+          <w:i/>
+          <w:iCs/>
+        </w:rPr>
+      </w:pPr>
+      <w:r>
+        <w:rPr>
+          <w:rFonts w:ascii="Times New Roman" w:eastAsia="Times New Roman" w:hAnsi="Times New Roman" w:cs="Times New Roman"/>
+          <w:i/>
+          <w:iCs/>
+        </w:rPr>
+        <w:t>Caso Base: Si la lista se encuentra vacía (</w:t>
+      </w:r>
+      <w:proofErr w:type="spellStart"/>
+      <w:r>
+        <w:rPr>
+          <w:rFonts w:ascii="Times New Roman" w:eastAsia="Times New Roman" w:hAnsi="Times New Roman" w:cs="Times New Roman"/>
+          <w:i/>
+          <w:iCs/>
+        </w:rPr>
+        <w:t>if</w:t>
+      </w:r>
+      <w:proofErr w:type="spellEnd"/>
+      <w:r>
+        <w:rPr>
+          <w:rFonts w:ascii="Times New Roman" w:eastAsia="Times New Roman" w:hAnsi="Times New Roman" w:cs="Times New Roman"/>
+          <w:i/>
+          <w:iCs/>
+        </w:rPr>
+        <w:t xml:space="preserve"> </w:t>
+      </w:r>
+      <w:proofErr w:type="spellStart"/>
+      <w:r>
+        <w:rPr>
+          <w:rFonts w:ascii="Times New Roman" w:eastAsia="Times New Roman" w:hAnsi="Times New Roman" w:cs="Times New Roman"/>
+          <w:i/>
+          <w:iCs/>
+        </w:rPr>
+        <w:t>lista_paquetes</w:t>
+      </w:r>
+      <w:proofErr w:type="spellEnd"/>
+      <w:r>
+        <w:rPr>
+          <w:rFonts w:ascii="Times New Roman" w:eastAsia="Times New Roman" w:hAnsi="Times New Roman" w:cs="Times New Roman"/>
+          <w:i/>
+          <w:iCs/>
+        </w:rPr>
+        <w:t xml:space="preserve"> == []:), retorna una lista vacía [], lo que sirve como base para construir la lista final.</w:t>
+      </w:r>
+    </w:p>
+    <w:p>
+      <w:pPr>
+        <w:pStyle w:val="Prrafodelista"/>
+        <w:numPr>
+          <w:ilvl w:val="0"/>
+          <w:numId w:val="30"/>
+        </w:numPr>
+        <w:spacing w:after="100" w:afterAutospacing="1"/>
+        <w:jc w:val="both"/>
+        <w:rPr>
+          <w:rFonts w:ascii="Times New Roman" w:eastAsia="Times New Roman" w:hAnsi="Times New Roman" w:cs="Times New Roman"/>
+          <w:i/>
+          <w:iCs/>
+        </w:rPr>
+      </w:pPr>
+      <w:r>
+        <w:rPr>
+          <w:rFonts w:ascii="Times New Roman" w:eastAsia="Times New Roman" w:hAnsi="Times New Roman" w:cs="Times New Roman"/>
+          <w:i/>
+          <w:iCs/>
+        </w:rPr>
+        <w:t>Casos Recursivos:</w:t>
+      </w:r>
+    </w:p>
+    <w:p>
+      <w:pPr>
+        <w:pStyle w:val="Prrafodelista"/>
+        <w:numPr>
+          <w:ilvl w:val="1"/>
+          <w:numId w:val="30"/>
+        </w:numPr>
+        <w:spacing w:after="100" w:afterAutospacing="1"/>
+        <w:jc w:val="both"/>
+        <w:rPr>
+          <w:rFonts w:ascii="Times New Roman" w:eastAsia="Times New Roman" w:hAnsi="Times New Roman" w:cs="Times New Roman"/>
+          <w:i/>
+          <w:iCs/>
+        </w:rPr>
+      </w:pPr>
+      <w:r>
+        <w:rPr>
+          <w:rFonts w:ascii="Times New Roman" w:eastAsia="Times New Roman" w:hAnsi="Times New Roman" w:cs="Times New Roman"/>
+          <w:i/>
+          <w:iCs/>
+        </w:rPr>
+        <w:t>Si supera el peso límite: Si el peso del primer paquete evaluado es mayor al límite (</w:t>
+      </w:r>
+      <w:proofErr w:type="spellStart"/>
+      <w:r>
+        <w:rPr>
+          <w:rFonts w:ascii="Times New Roman" w:eastAsia="Times New Roman" w:hAnsi="Times New Roman" w:cs="Times New Roman"/>
+          <w:i/>
+          <w:iCs/>
+        </w:rPr>
+        <w:t>if</w:t>
+      </w:r>
+      <w:proofErr w:type="spellEnd"/>
+      <w:r>
+        <w:rPr>
+          <w:rFonts w:ascii="Times New Roman" w:eastAsia="Times New Roman" w:hAnsi="Times New Roman" w:cs="Times New Roman"/>
+          <w:i/>
+          <w:iCs/>
+        </w:rPr>
+        <w:t xml:space="preserve"> </w:t>
+      </w:r>
+      <w:proofErr w:type="spellStart"/>
+      <w:r>
+        <w:rPr>
+          <w:rFonts w:ascii="Times New Roman" w:eastAsia="Times New Roman" w:hAnsi="Times New Roman" w:cs="Times New Roman"/>
+          <w:i/>
+          <w:iCs/>
+        </w:rPr>
+        <w:t>lista_</w:t>
+      </w:r>
+      <w:proofErr w:type="gramStart"/>
+      <w:r>
+        <w:rPr>
+          <w:rFonts w:ascii="Times New Roman" w:eastAsia="Times New Roman" w:hAnsi="Times New Roman" w:cs="Times New Roman"/>
+          <w:i/>
+          <w:iCs/>
+        </w:rPr>
+        <w:t>paquetes</w:t>
+      </w:r>
+      <w:proofErr w:type="spellEnd"/>
+      <w:r>
+        <w:rPr>
+          <w:rFonts w:ascii="Times New Roman" w:eastAsia="Times New Roman" w:hAnsi="Times New Roman" w:cs="Times New Roman"/>
+          <w:i/>
+          <w:iCs/>
+        </w:rPr>
+        <w:t>[</w:t>
+      </w:r>
+      <w:proofErr w:type="gramEnd"/>
+      <w:r>
+        <w:rPr>
+          <w:rFonts w:ascii="Times New Roman" w:eastAsia="Times New Roman" w:hAnsi="Times New Roman" w:cs="Times New Roman"/>
+          <w:i/>
+          <w:iCs/>
+        </w:rPr>
+        <w:t xml:space="preserve">0][1] &gt; </w:t>
+      </w:r>
+      <w:proofErr w:type="spellStart"/>
+      <w:r>
+        <w:rPr>
+          <w:rFonts w:ascii="Times New Roman" w:eastAsia="Times New Roman" w:hAnsi="Times New Roman" w:cs="Times New Roman"/>
+          <w:i/>
+          <w:iCs/>
+        </w:rPr>
+        <w:t>peso_limite</w:t>
+      </w:r>
+      <w:proofErr w:type="spellEnd"/>
+      <w:r>
+        <w:rPr>
+          <w:rFonts w:ascii="Times New Roman" w:eastAsia="Times New Roman" w:hAnsi="Times New Roman" w:cs="Times New Roman"/>
+          <w:i/>
+          <w:iCs/>
+        </w:rPr>
+        <w:t>:), se toma el código del paquete (</w:t>
+      </w:r>
+      <w:proofErr w:type="spellStart"/>
+      <w:r>
+        <w:rPr>
+          <w:rFonts w:ascii="Times New Roman" w:eastAsia="Times New Roman" w:hAnsi="Times New Roman" w:cs="Times New Roman"/>
+          <w:i/>
+          <w:iCs/>
+        </w:rPr>
+        <w:t>lista_</w:t>
+      </w:r>
+      <w:proofErr w:type="gramStart"/>
+      <w:r>
+        <w:rPr>
+          <w:rFonts w:ascii="Times New Roman" w:eastAsia="Times New Roman" w:hAnsi="Times New Roman" w:cs="Times New Roman"/>
+          <w:i/>
+          <w:iCs/>
+        </w:rPr>
+        <w:t>paquetes</w:t>
+      </w:r>
+      <w:proofErr w:type="spellEnd"/>
+      <w:r>
+        <w:rPr>
+          <w:rFonts w:ascii="Times New Roman" w:eastAsia="Times New Roman" w:hAnsi="Times New Roman" w:cs="Times New Roman"/>
+          <w:i/>
+          <w:iCs/>
+        </w:rPr>
+        <w:t>[</w:t>
+      </w:r>
+      <w:proofErr w:type="gramEnd"/>
+      <w:r>
+        <w:rPr>
+          <w:rFonts w:ascii="Times New Roman" w:eastAsia="Times New Roman" w:hAnsi="Times New Roman" w:cs="Times New Roman"/>
+          <w:i/>
+          <w:iCs/>
+        </w:rPr>
+        <w:t>0][0]) y se concatena en forma de lista con el resultado del llamado recursivo del resto de los paquetes ([</w:t>
+      </w:r>
+      <w:proofErr w:type="spellStart"/>
+      <w:r>
+        <w:rPr>
+          <w:rFonts w:ascii="Times New Roman" w:eastAsia="Times New Roman" w:hAnsi="Times New Roman" w:cs="Times New Roman"/>
+          <w:i/>
+          <w:iCs/>
+        </w:rPr>
+        <w:t>lista_</w:t>
+      </w:r>
+      <w:proofErr w:type="gramStart"/>
+      <w:r>
+        <w:rPr>
+          <w:rFonts w:ascii="Times New Roman" w:eastAsia="Times New Roman" w:hAnsi="Times New Roman" w:cs="Times New Roman"/>
+          <w:i/>
+          <w:iCs/>
+        </w:rPr>
+        <w:t>paquetes</w:t>
+      </w:r>
+      <w:proofErr w:type="spellEnd"/>
+      <w:r>
+        <w:rPr>
+          <w:rFonts w:ascii="Times New Roman" w:eastAsia="Times New Roman" w:hAnsi="Times New Roman" w:cs="Times New Roman"/>
+          <w:i/>
+          <w:iCs/>
+        </w:rPr>
+        <w:t>[</w:t>
+      </w:r>
+      <w:proofErr w:type="gramEnd"/>
+      <w:r>
+        <w:rPr>
+          <w:rFonts w:ascii="Times New Roman" w:eastAsia="Times New Roman" w:hAnsi="Times New Roman" w:cs="Times New Roman"/>
+          <w:i/>
+          <w:iCs/>
+        </w:rPr>
+        <w:t xml:space="preserve">0][0]] + </w:t>
+      </w:r>
+      <w:proofErr w:type="spellStart"/>
+      <w:r>
+        <w:rPr>
+          <w:rFonts w:ascii="Times New Roman" w:eastAsia="Times New Roman" w:hAnsi="Times New Roman" w:cs="Times New Roman"/>
+          <w:i/>
+          <w:iCs/>
+        </w:rPr>
+        <w:t>obtener_paquetes_sobrepeso</w:t>
+      </w:r>
+      <w:proofErr w:type="spellEnd"/>
+      <w:r>
+        <w:rPr>
+          <w:rFonts w:ascii="Times New Roman" w:eastAsia="Times New Roman" w:hAnsi="Times New Roman" w:cs="Times New Roman"/>
+          <w:i/>
+          <w:iCs/>
+        </w:rPr>
+        <w:t>(</w:t>
+      </w:r>
+      <w:proofErr w:type="spellStart"/>
+      <w:r>
+        <w:rPr>
+          <w:rFonts w:ascii="Times New Roman" w:eastAsia="Times New Roman" w:hAnsi="Times New Roman" w:cs="Times New Roman"/>
+          <w:i/>
+          <w:iCs/>
+        </w:rPr>
+        <w:t>lista_</w:t>
+      </w:r>
+      <w:proofErr w:type="gramStart"/>
+      <w:r>
+        <w:rPr>
+          <w:rFonts w:ascii="Times New Roman" w:eastAsia="Times New Roman" w:hAnsi="Times New Roman" w:cs="Times New Roman"/>
+          <w:i/>
+          <w:iCs/>
+        </w:rPr>
+        <w:t>paquetes</w:t>
+      </w:r>
+      <w:proofErr w:type="spellEnd"/>
+      <w:r>
+        <w:rPr>
+          <w:rFonts w:ascii="Times New Roman" w:eastAsia="Times New Roman" w:hAnsi="Times New Roman" w:cs="Times New Roman"/>
+          <w:i/>
+          <w:iCs/>
+        </w:rPr>
+        <w:t>[</w:t>
+      </w:r>
+      <w:proofErr w:type="gramEnd"/>
+      <w:r>
+        <w:rPr>
+          <w:rFonts w:ascii="Times New Roman" w:eastAsia="Times New Roman" w:hAnsi="Times New Roman" w:cs="Times New Roman"/>
+          <w:i/>
+          <w:iCs/>
+        </w:rPr>
+        <w:t xml:space="preserve">1:], </w:t>
+      </w:r>
+      <w:proofErr w:type="spellStart"/>
+      <w:r>
+        <w:rPr>
+          <w:rFonts w:ascii="Times New Roman" w:eastAsia="Times New Roman" w:hAnsi="Times New Roman" w:cs="Times New Roman"/>
+          <w:i/>
+          <w:iCs/>
+        </w:rPr>
+        <w:t>peso_limite</w:t>
+      </w:r>
+      <w:proofErr w:type="spellEnd"/>
+      <w:r>
+        <w:rPr>
+          <w:rFonts w:ascii="Times New Roman" w:eastAsia="Times New Roman" w:hAnsi="Times New Roman" w:cs="Times New Roman"/>
+          <w:i/>
+          <w:iCs/>
+        </w:rPr>
+        <w:t>)).</w:t>
+      </w:r>
+    </w:p>
+    <w:p>
+      <w:pPr>
+        <w:pStyle w:val="Prrafodelista"/>
+        <w:numPr>
+          <w:ilvl w:val="1"/>
+          <w:numId w:val="30"/>
+        </w:numPr>
+        <w:spacing w:after="100" w:afterAutospacing="1"/>
+        <w:jc w:val="both"/>
+        <w:rPr>
+          <w:rFonts w:ascii="Times New Roman" w:eastAsia="Times New Roman" w:hAnsi="Times New Roman" w:cs="Times New Roman"/>
+          <w:i/>
+          <w:iCs/>
+        </w:rPr>
+      </w:pPr>
+      <w:r>
+        <w:rPr>
+          <w:rFonts w:ascii="Times New Roman" w:eastAsia="Times New Roman" w:hAnsi="Times New Roman" w:cs="Times New Roman"/>
+          <w:i/>
+          <w:iCs/>
+        </w:rPr>
+        <w:t>Si NO supera el peso límite: Si el paquete está dentro del peso permitido, se ignora su código y se avanza al siguiente elemento realizando el llamado recursivo con el resto de la lista (</w:t>
+      </w:r>
+      <w:proofErr w:type="spellStart"/>
+      <w:r>
+        <w:rPr>
+          <w:rFonts w:ascii="Times New Roman" w:eastAsia="Times New Roman" w:hAnsi="Times New Roman" w:cs="Times New Roman"/>
+          <w:i/>
+          <w:iCs/>
+        </w:rPr>
+        <w:t>obtener_paquetes_sobrepeso</w:t>
+      </w:r>
+      <w:proofErr w:type="spellEnd"/>
+      <w:r>
+        <w:rPr>
+          <w:rFonts w:ascii="Times New Roman" w:eastAsia="Times New Roman" w:hAnsi="Times New Roman" w:cs="Times New Roman"/>
+          <w:i/>
+          <w:iCs/>
+        </w:rPr>
+        <w:t>(</w:t>
+      </w:r>
+      <w:proofErr w:type="spellStart"/>
+      <w:r>
+        <w:rPr>
+          <w:rFonts w:ascii="Times New Roman" w:eastAsia="Times New Roman" w:hAnsi="Times New Roman" w:cs="Times New Roman"/>
+          <w:i/>
+          <w:iCs/>
+        </w:rPr>
+        <w:t>lista_</w:t>
+      </w:r>
+      <w:proofErr w:type="gramStart"/>
+      <w:r>
+        <w:rPr>
+          <w:rFonts w:ascii="Times New Roman" w:eastAsia="Times New Roman" w:hAnsi="Times New Roman" w:cs="Times New Roman"/>
+          <w:i/>
+          <w:iCs/>
+        </w:rPr>
+        <w:t>paquetes</w:t>
+      </w:r>
+      <w:proofErr w:type="spellEnd"/>
+      <w:r>
+        <w:rPr>
+          <w:rFonts w:ascii="Times New Roman" w:eastAsia="Times New Roman" w:hAnsi="Times New Roman" w:cs="Times New Roman"/>
+          <w:i/>
+          <w:iCs/>
+        </w:rPr>
+        <w:t>[</w:t>
+      </w:r>
+      <w:proofErr w:type="gramEnd"/>
+      <w:r>
+        <w:rPr>
+          <w:rFonts w:ascii="Times New Roman" w:eastAsia="Times New Roman" w:hAnsi="Times New Roman" w:cs="Times New Roman"/>
+          <w:i/>
+          <w:iCs/>
+        </w:rPr>
+        <w:t xml:space="preserve">1:], </w:t>
+      </w:r>
+      <w:proofErr w:type="spellStart"/>
+      <w:r>
+        <w:rPr>
+          <w:rFonts w:ascii="Times New Roman" w:eastAsia="Times New Roman" w:hAnsi="Times New Roman" w:cs="Times New Roman"/>
+          <w:i/>
+          <w:iCs/>
+        </w:rPr>
+        <w:t>peso_limite</w:t>
+      </w:r>
+      <w:proofErr w:type="spellEnd"/>
+      <w:r>
+        <w:rPr>
+          <w:rFonts w:ascii="Times New Roman" w:eastAsia="Times New Roman" w:hAnsi="Times New Roman" w:cs="Times New Roman"/>
+          <w:i/>
+          <w:iCs/>
+        </w:rPr>
+        <w:t>)).</w:t>
+      </w:r>
+    </w:p>
+    <w:p>
+      <w:pPr>
+        <w:spacing w:after="100" w:afterAutospacing="1"/>
+        <w:jc w:val="both"/>
+        <w:rPr>
+          <w:rFonts w:ascii="Times New Roman" w:eastAsia="Times New Roman" w:hAnsi="Times New Roman" w:cs="Times New Roman"/>
+          <w:i/>
+          <w:iCs/>
+        </w:rPr>
+      </w:pPr>
+      <w:r>
+        <w:rPr>
+          <w:rFonts w:ascii="Times New Roman" w:eastAsia="Times New Roman" w:hAnsi="Times New Roman" w:cs="Times New Roman"/>
+          <w:i/>
+          <w:iCs/>
+        </w:rPr>
+        <w:t>Diagrama de Flujo / Traza de Llamadas (Ejemplo límite 20kg: P1(25kg), P2(10kg)):</w:t>
+      </w:r>
+    </w:p>
+    <w:p>
+      <w:pPr>
+        <w:pStyle w:val="Prrafodelista"/>
+        <w:numPr>
+          <w:ilvl w:val="1"/>
+          <w:numId w:val="23"/>
+        </w:numPr>
+        <w:spacing w:after="100" w:afterAutospacing="1"/>
+        <w:jc w:val="both"/>
+        <w:rPr>
+          <w:rFonts w:ascii="Times New Roman" w:eastAsia="Times New Roman" w:hAnsi="Times New Roman" w:cs="Times New Roman"/>
+          <w:i/>
+          <w:iCs/>
+        </w:rPr>
+      </w:pPr>
+      <w:proofErr w:type="spellStart"/>
+      <w:r>
+        <w:rPr>
+          <w:rFonts w:ascii="Times New Roman" w:eastAsia="Times New Roman" w:hAnsi="Times New Roman" w:cs="Times New Roman"/>
+          <w:i/>
+          <w:iCs/>
+        </w:rPr>
+        <w:t>obtener_paquetes_sobrepeso</w:t>
+      </w:r>
+      <w:proofErr w:type="spellEnd"/>
+      <w:r>
+        <w:rPr>
+          <w:rFonts w:ascii="Times New Roman" w:eastAsia="Times New Roman" w:hAnsi="Times New Roman" w:cs="Times New Roman"/>
+          <w:i/>
+          <w:iCs/>
+        </w:rPr>
+        <w:t xml:space="preserve">([P1(25kg), P2(10kg)], 20) -&gt; 25 &gt; 20, retorna [Código_P1] + </w:t>
+      </w:r>
+      <w:proofErr w:type="spellStart"/>
+      <w:r>
+        <w:rPr>
+          <w:rFonts w:ascii="Times New Roman" w:eastAsia="Times New Roman" w:hAnsi="Times New Roman" w:cs="Times New Roman"/>
+          <w:i/>
+          <w:iCs/>
+        </w:rPr>
+        <w:t>obtener_paquetes_sobrepeso</w:t>
+      </w:r>
+      <w:proofErr w:type="spellEnd"/>
+      <w:r>
+        <w:rPr>
+          <w:rFonts w:ascii="Times New Roman" w:eastAsia="Times New Roman" w:hAnsi="Times New Roman" w:cs="Times New Roman"/>
+          <w:i/>
+          <w:iCs/>
+        </w:rPr>
+        <w:t xml:space="preserve">([P2(10kg)], 20).  </w:t>
+      </w:r>
+    </w:p>
+    <w:p>
+      <w:pPr>
+        <w:pStyle w:val="Prrafodelista"/>
+        <w:numPr>
+          <w:ilvl w:val="1"/>
+          <w:numId w:val="23"/>
+        </w:numPr>
+        <w:spacing w:after="100" w:afterAutospacing="1"/>
+        <w:jc w:val="both"/>
+        <w:rPr>
+          <w:rFonts w:ascii="Times New Roman" w:eastAsia="Times New Roman" w:hAnsi="Times New Roman" w:cs="Times New Roman"/>
+          <w:i/>
+          <w:iCs/>
+        </w:rPr>
+      </w:pPr>
+      <w:proofErr w:type="spellStart"/>
+      <w:r>
+        <w:rPr>
+          <w:rFonts w:ascii="Times New Roman" w:eastAsia="Times New Roman" w:hAnsi="Times New Roman" w:cs="Times New Roman"/>
+          <w:i/>
+          <w:iCs/>
+        </w:rPr>
+        <w:t>obtener_paquetes_sobrepeso</w:t>
+      </w:r>
+      <w:proofErr w:type="spellEnd"/>
+      <w:r>
+        <w:rPr>
+          <w:rFonts w:ascii="Times New Roman" w:eastAsia="Times New Roman" w:hAnsi="Times New Roman" w:cs="Times New Roman"/>
+          <w:i/>
+          <w:iCs/>
+        </w:rPr>
+        <w:t xml:space="preserve">([P2(10kg)], 20) -&gt; 10 &lt; 20, retorna </w:t>
+      </w:r>
+      <w:proofErr w:type="spellStart"/>
+      <w:r>
+        <w:rPr>
+          <w:rFonts w:ascii="Times New Roman" w:eastAsia="Times New Roman" w:hAnsi="Times New Roman" w:cs="Times New Roman"/>
+          <w:i/>
+          <w:iCs/>
+        </w:rPr>
+        <w:t>obtener_paquetes_</w:t>
+      </w:r>
+      <w:proofErr w:type="gramStart"/>
+      <w:r>
+        <w:rPr>
+          <w:rFonts w:ascii="Times New Roman" w:eastAsia="Times New Roman" w:hAnsi="Times New Roman" w:cs="Times New Roman"/>
+          <w:i/>
+          <w:iCs/>
+        </w:rPr>
+        <w:t>sobrepeso</w:t>
+      </w:r>
+      <w:proofErr w:type="spellEnd"/>
+      <w:r>
+        <w:rPr>
+          <w:rFonts w:ascii="Times New Roman" w:eastAsia="Times New Roman" w:hAnsi="Times New Roman" w:cs="Times New Roman"/>
+          <w:i/>
+          <w:iCs/>
+        </w:rPr>
+        <w:t>(</w:t>
+      </w:r>
+      <w:proofErr w:type="gramEnd"/>
+      <w:r>
+        <w:rPr>
+          <w:rFonts w:ascii="Times New Roman" w:eastAsia="Times New Roman" w:hAnsi="Times New Roman" w:cs="Times New Roman"/>
+          <w:i/>
+          <w:iCs/>
+        </w:rPr>
+        <w:t xml:space="preserve">[], 20).  </w:t>
+      </w:r>
+    </w:p>
+    <w:p>
+      <w:pPr>
+        <w:pStyle w:val="Prrafodelista"/>
+        <w:numPr>
+          <w:ilvl w:val="1"/>
+          <w:numId w:val="23"/>
+        </w:numPr>
+        <w:spacing w:after="100" w:afterAutospacing="1"/>
+        <w:jc w:val="both"/>
+        <w:rPr>
+          <w:rFonts w:ascii="Times New Roman" w:eastAsia="Times New Roman" w:hAnsi="Times New Roman" w:cs="Times New Roman"/>
+          <w:i/>
+          <w:iCs/>
+        </w:rPr>
+      </w:pPr>
+      <w:proofErr w:type="spellStart"/>
+      <w:r>
+        <w:rPr>
+          <w:rFonts w:ascii="Times New Roman" w:eastAsia="Times New Roman" w:hAnsi="Times New Roman" w:cs="Times New Roman"/>
+          <w:i/>
+          <w:iCs/>
+        </w:rPr>
+        <w:t>obtener_paquetes_</w:t>
+      </w:r>
+      <w:proofErr w:type="gramStart"/>
+      <w:r>
+        <w:rPr>
+          <w:rFonts w:ascii="Times New Roman" w:eastAsia="Times New Roman" w:hAnsi="Times New Roman" w:cs="Times New Roman"/>
+          <w:i/>
+          <w:iCs/>
+        </w:rPr>
+        <w:t>sobrepeso</w:t>
+      </w:r>
+      <w:proofErr w:type="spellEnd"/>
+      <w:r>
+        <w:rPr>
+          <w:rFonts w:ascii="Times New Roman" w:eastAsia="Times New Roman" w:hAnsi="Times New Roman" w:cs="Times New Roman"/>
+          <w:i/>
+          <w:iCs/>
+        </w:rPr>
+        <w:t>(</w:t>
+      </w:r>
+      <w:proofErr w:type="gramEnd"/>
+      <w:r>
+        <w:rPr>
+          <w:rFonts w:ascii="Times New Roman" w:eastAsia="Times New Roman" w:hAnsi="Times New Roman" w:cs="Times New Roman"/>
+          <w:i/>
+          <w:iCs/>
+        </w:rPr>
+        <w:t xml:space="preserve">[], 20) -&gt; Caso base, retorna [].  </w:t>
+      </w:r>
+    </w:p>
+    <w:p>
+      <w:pPr>
+        <w:pStyle w:val="Prrafodelista"/>
+        <w:numPr>
+          <w:ilvl w:val="1"/>
+          <w:numId w:val="23"/>
+        </w:numPr>
+        <w:spacing w:after="100" w:afterAutospacing="1"/>
+        <w:jc w:val="both"/>
+        <w:rPr>
+          <w:rFonts w:ascii="Times New Roman" w:eastAsia="Times New Roman" w:hAnsi="Times New Roman" w:cs="Times New Roman"/>
+          <w:i/>
+          <w:iCs/>
+        </w:rPr>
+      </w:pPr>
+      <w:proofErr w:type="spellStart"/>
+      <w:r>
+        <w:rPr>
+          <w:rFonts w:ascii="Times New Roman" w:eastAsia="Times New Roman" w:hAnsi="Times New Roman" w:cs="Times New Roman"/>
+          <w:i/>
+          <w:iCs/>
+        </w:rPr>
+        <w:t>Desapilado</w:t>
+      </w:r>
+      <w:proofErr w:type="spellEnd"/>
+      <w:r>
+        <w:rPr>
+          <w:rFonts w:ascii="Times New Roman" w:eastAsia="Times New Roman" w:hAnsi="Times New Roman" w:cs="Times New Roman"/>
+          <w:i/>
+          <w:iCs/>
+        </w:rPr>
+        <w:t>: [] -&gt; [Código_P1] + [] = [Código_P1]. Lista final generada.</w:t>
+      </w:r>
+    </w:p>
+    <w:p>
+      <w:pPr>
+        <w:spacing w:after="100" w:afterAutospacing="1"/>
+        <w:jc w:val="both"/>
+        <w:rPr>
+          <w:rFonts w:ascii="Arial" w:eastAsia="Times New Roman" w:hAnsi="Arial" w:cs="Arial"/>
+        </w:rPr>
+      </w:pPr>
     </w:p>
     <w:sectPr>
       <w:headerReference w:type="default" r:id="rId9"/>
@@ -1011,6 +3056,244 @@
 <file path=word/numbering.xml><?xml version="1.0" encoding="utf-8"?>
 <w:numbering xmlns:wpc="http://schemas.microsoft.com/office/word/2010/wordprocessingCanvas" xmlns:cx="http://schemas.microsoft.com/office/drawing/2014/chartex" xmlns:cx1="http://schemas.microsoft.com/office/drawing/2015/9/8/chartex" xmlns:cx2="http://schemas.microsoft.com/office/drawing/2015/10/21/chartex" xmlns:cx3="http://schemas.microsoft.com/office/drawing/2016/5/9/chartex" xmlns:cx4="http://schemas.microsoft.com/office/drawing/2016/5/10/chartex" xmlns:cx5="http://schemas.microsoft.com/office/drawing/2016/5/11/chartex" xmlns:cx6="http://schemas.microsoft.com/office/drawing/2016/5/12/chartex" xmlns:cx7="http://schemas.microsoft.com/office/drawing/2016/5/13/chartex" xmlns:cx8="http://schemas.microsoft.com/office/drawing/2016/5/14/chartex" xmlns:mc="http://schemas.openxmlformats.org/markup-compatibility/2006" xmlns:aink="http://schemas.microsoft.com/office/drawing/2016/ink" xmlns:am3d="http://schemas.microsoft.com/office/drawing/2017/model3d" xmlns:o="urn:schemas-microsoft-com:office:office" xmlns:oel="http://schemas.microsoft.com/office/2019/extlst" xmlns:r="http://schemas.openxmlformats.org/officeDocument/2006/relationships" xmlns:m="http://schemas.openxmlformats.org/officeDocument/2006/math" xmlns:v="urn:schemas-microsoft-com:vml" xmlns:wp14="http://schemas.microsoft.com/office/word/2010/wordprocessingDrawing" xmlns:wp="http://schemas.openxmlformats.org/drawingml/2006/wordprocessingDrawing" xmlns:w10="urn:schemas-microsoft-com:office:word" xmlns:w="http://schemas.openxmlformats.org/wordprocessingml/2006/main" xmlns:w14="http://schemas.microsoft.com/office/word/2010/wordml" xmlns:w15="http://schemas.microsoft.com/office/word/2012/wordml" xmlns:w16cex="http://schemas.microsoft.com/office/word/2018/wordml/cex" xmlns:w16cid="http://schemas.microsoft.com/office/word/2016/wordml/cid" xmlns:w16="http://schemas.microsoft.com/office/word/2018/wordml" xmlns:w16du="http://schemas.microsoft.com/office/word/2023/wordml/word16du" xmlns:w16sdtdh="http://schemas.microsoft.com/office/word/2020/wordml/sdtdatahash" xmlns:w16sdtfl="http://schemas.microsoft.com/office/word/2024/wordml/sdtformatlock" xmlns:w16se="http://schemas.microsoft.com/office/word/2015/wordml/symex" xmlns:wpg="http://schemas.microsoft.com/office/word/2010/wordprocessingGroup" xmlns:wpi="http://schemas.microsoft.com/office/word/2010/wordprocessingInk" xmlns:wne="http://schemas.microsoft.com/office/word/2006/wordml" xmlns:wps="http://schemas.microsoft.com/office/word/2010/wordprocessingShape" mc:Ignorable="w14 w15 w16se w16cid w16 w16cex w16sdtdh w16sdtfl w16du wp14">
   <w:abstractNum w:abstractNumId="0" w15:restartNumberingAfterBreak="0">
+    <w:nsid w:val="029A0AE1"/>
+    <w:multiLevelType w:val="hybridMultilevel"/>
+    <w:tmpl w:val="DDF001F2"/>
+    <w:lvl w:ilvl="0" w:tplc="240A000F">
+      <w:start w:val="1"/>
+      <w:numFmt w:val="decimal"/>
+      <w:lvlText w:val="%1."/>
+      <w:lvlJc w:val="left"/>
+      <w:pPr>
+        <w:ind w:left="360" w:hanging="360"/>
+      </w:pPr>
+      <w:rPr>
+        <w:rFonts w:hint="default"/>
+      </w:rPr>
+    </w:lvl>
+    <w:lvl w:ilvl="1" w:tplc="240A000F">
+      <w:start w:val="1"/>
+      <w:numFmt w:val="decimal"/>
+      <w:lvlText w:val="%2."/>
+      <w:lvlJc w:val="left"/>
+      <w:pPr>
+        <w:ind w:left="1080" w:hanging="360"/>
+      </w:pPr>
+    </w:lvl>
+    <w:lvl w:ilvl="2" w:tplc="240A001B" w:tentative="1">
+      <w:start w:val="1"/>
+      <w:numFmt w:val="lowerRoman"/>
+      <w:lvlText w:val="%3."/>
+      <w:lvlJc w:val="right"/>
+      <w:pPr>
+        <w:ind w:left="1800" w:hanging="180"/>
+      </w:pPr>
+    </w:lvl>
+    <w:lvl w:ilvl="3" w:tplc="240A000F" w:tentative="1">
+      <w:start w:val="1"/>
+      <w:numFmt w:val="decimal"/>
+      <w:lvlText w:val="%4."/>
+      <w:lvlJc w:val="left"/>
+      <w:pPr>
+        <w:ind w:left="2520" w:hanging="360"/>
+      </w:pPr>
+    </w:lvl>
+    <w:lvl w:ilvl="4" w:tplc="240A0019" w:tentative="1">
+      <w:start w:val="1"/>
+      <w:numFmt w:val="lowerLetter"/>
+      <w:lvlText w:val="%5."/>
+      <w:lvlJc w:val="left"/>
+      <w:pPr>
+        <w:ind w:left="3240" w:hanging="360"/>
+      </w:pPr>
+    </w:lvl>
+    <w:lvl w:ilvl="5" w:tplc="240A001B" w:tentative="1">
+      <w:start w:val="1"/>
+      <w:numFmt w:val="lowerRoman"/>
+      <w:lvlText w:val="%6."/>
+      <w:lvlJc w:val="right"/>
+      <w:pPr>
+        <w:ind w:left="3960" w:hanging="180"/>
+      </w:pPr>
+    </w:lvl>
+    <w:lvl w:ilvl="6" w:tplc="240A000F" w:tentative="1">
+      <w:start w:val="1"/>
+      <w:numFmt w:val="decimal"/>
+      <w:lvlText w:val="%7."/>
+      <w:lvlJc w:val="left"/>
+      <w:pPr>
+        <w:ind w:left="4680" w:hanging="360"/>
+      </w:pPr>
+    </w:lvl>
+    <w:lvl w:ilvl="7" w:tplc="240A0019" w:tentative="1">
+      <w:start w:val="1"/>
+      <w:numFmt w:val="lowerLetter"/>
+      <w:lvlText w:val="%8."/>
+      <w:lvlJc w:val="left"/>
+      <w:pPr>
+        <w:ind w:left="5400" w:hanging="360"/>
+      </w:pPr>
+    </w:lvl>
+    <w:lvl w:ilvl="8" w:tplc="240A001B" w:tentative="1">
+      <w:start w:val="1"/>
+      <w:numFmt w:val="lowerRoman"/>
+      <w:lvlText w:val="%9."/>
+      <w:lvlJc w:val="right"/>
+      <w:pPr>
+        <w:ind w:left="6120" w:hanging="180"/>
+      </w:pPr>
+    </w:lvl>
+  </w:abstractNum>
+  <w:abstractNum w:abstractNumId="1" w15:restartNumberingAfterBreak="0">
+    <w:nsid w:val="0739554D"/>
+    <w:multiLevelType w:val="multilevel"/>
+    <w:tmpl w:val="7CA08A68"/>
+    <w:lvl w:ilvl="0">
+      <w:start w:val="1"/>
+      <w:numFmt w:val="bullet"/>
+      <w:lvlText w:val=""/>
+      <w:lvlJc w:val="left"/>
+      <w:pPr>
+        <w:tabs>
+          <w:tab w:val="num" w:pos="720"/>
+        </w:tabs>
+        <w:ind w:left="720" w:hanging="360"/>
+      </w:pPr>
+      <w:rPr>
+        <w:rFonts w:ascii="Symbol" w:hAnsi="Symbol" w:hint="default"/>
+        <w:sz w:val="20"/>
+      </w:rPr>
+    </w:lvl>
+    <w:lvl w:ilvl="1" w:tentative="1">
+      <w:start w:val="1"/>
+      <w:numFmt w:val="bullet"/>
+      <w:lvlText w:val="o"/>
+      <w:lvlJc w:val="left"/>
+      <w:pPr>
+        <w:tabs>
+          <w:tab w:val="num" w:pos="1440"/>
+        </w:tabs>
+        <w:ind w:left="1440" w:hanging="360"/>
+      </w:pPr>
+      <w:rPr>
+        <w:rFonts w:ascii="Courier New" w:hAnsi="Courier New" w:hint="default"/>
+        <w:sz w:val="20"/>
+      </w:rPr>
+    </w:lvl>
+    <w:lvl w:ilvl="2" w:tentative="1">
+      <w:start w:val="1"/>
+      <w:numFmt w:val="bullet"/>
+      <w:lvlText w:val=""/>
+      <w:lvlJc w:val="left"/>
+      <w:pPr>
+        <w:tabs>
+          <w:tab w:val="num" w:pos="2160"/>
+        </w:tabs>
+        <w:ind w:left="2160" w:hanging="360"/>
+      </w:pPr>
+      <w:rPr>
+        <w:rFonts w:ascii="Wingdings" w:hAnsi="Wingdings" w:hint="default"/>
+        <w:sz w:val="20"/>
+      </w:rPr>
+    </w:lvl>
+    <w:lvl w:ilvl="3" w:tentative="1">
+      <w:start w:val="1"/>
+      <w:numFmt w:val="bullet"/>
+      <w:lvlText w:val=""/>
+      <w:lvlJc w:val="left"/>
+      <w:pPr>
+        <w:tabs>
+          <w:tab w:val="num" w:pos="2880"/>
+        </w:tabs>
+        <w:ind w:left="2880" w:hanging="360"/>
+      </w:pPr>
+      <w:rPr>
+        <w:rFonts w:ascii="Wingdings" w:hAnsi="Wingdings" w:hint="default"/>
+        <w:sz w:val="20"/>
+      </w:rPr>
+    </w:lvl>
+    <w:lvl w:ilvl="4" w:tentative="1">
+      <w:start w:val="1"/>
+      <w:numFmt w:val="bullet"/>
+      <w:lvlText w:val=""/>
+      <w:lvlJc w:val="left"/>
+      <w:pPr>
+        <w:tabs>
+          <w:tab w:val="num" w:pos="3600"/>
+        </w:tabs>
+        <w:ind w:left="3600" w:hanging="360"/>
+      </w:pPr>
+      <w:rPr>
+        <w:rFonts w:ascii="Wingdings" w:hAnsi="Wingdings" w:hint="default"/>
+        <w:sz w:val="20"/>
+      </w:rPr>
+    </w:lvl>
+    <w:lvl w:ilvl="5" w:tentative="1">
+      <w:start w:val="1"/>
+      <w:numFmt w:val="bullet"/>
+      <w:lvlText w:val=""/>
+      <w:lvlJc w:val="left"/>
+      <w:pPr>
+        <w:tabs>
+          <w:tab w:val="num" w:pos="4320"/>
+        </w:tabs>
+        <w:ind w:left="4320" w:hanging="360"/>
+      </w:pPr>
+      <w:rPr>
+        <w:rFonts w:ascii="Wingdings" w:hAnsi="Wingdings" w:hint="default"/>
+        <w:sz w:val="20"/>
+      </w:rPr>
+    </w:lvl>
+    <w:lvl w:ilvl="6" w:tentative="1">
+      <w:start w:val="1"/>
+      <w:numFmt w:val="bullet"/>
+      <w:lvlText w:val=""/>
+      <w:lvlJc w:val="left"/>
+      <w:pPr>
+        <w:tabs>
+          <w:tab w:val="num" w:pos="5040"/>
+        </w:tabs>
+        <w:ind w:left="5040" w:hanging="360"/>
+      </w:pPr>
+      <w:rPr>
+        <w:rFonts w:ascii="Wingdings" w:hAnsi="Wingdings" w:hint="default"/>
+        <w:sz w:val="20"/>
+      </w:rPr>
+    </w:lvl>
+    <w:lvl w:ilvl="7" w:tentative="1">
+      <w:start w:val="1"/>
+      <w:numFmt w:val="bullet"/>
+      <w:lvlText w:val=""/>
+      <w:lvlJc w:val="left"/>
+      <w:pPr>
+        <w:tabs>
+          <w:tab w:val="num" w:pos="5760"/>
+        </w:tabs>
+        <w:ind w:left="5760" w:hanging="360"/>
+      </w:pPr>
+      <w:rPr>
+        <w:rFonts w:ascii="Wingdings" w:hAnsi="Wingdings" w:hint="default"/>
+        <w:sz w:val="20"/>
+      </w:rPr>
+    </w:lvl>
+    <w:lvl w:ilvl="8" w:tentative="1">
+      <w:start w:val="1"/>
+      <w:numFmt w:val="bullet"/>
+      <w:lvlText w:val=""/>
+      <w:lvlJc w:val="left"/>
+      <w:pPr>
+        <w:tabs>
+          <w:tab w:val="num" w:pos="6480"/>
+        </w:tabs>
+        <w:ind w:left="6480" w:hanging="360"/>
+      </w:pPr>
+      <w:rPr>
+        <w:rFonts w:ascii="Wingdings" w:hAnsi="Wingdings" w:hint="default"/>
+        <w:sz w:val="20"/>
+      </w:rPr>
+    </w:lvl>
+  </w:abstractNum>
+  <w:abstractNum w:abstractNumId="2" w15:restartNumberingAfterBreak="0">
     <w:nsid w:val="0F8D3F7F"/>
     <w:multiLevelType w:val="multilevel"/>
     <w:tmpl w:val="65944878"/>
@@ -1159,7 +3442,7 @@
       </w:rPr>
     </w:lvl>
   </w:abstractNum>
-  <w:abstractNum w:abstractNumId="1" w15:restartNumberingAfterBreak="0">
+  <w:abstractNum w:abstractNumId="3" w15:restartNumberingAfterBreak="0">
     <w:nsid w:val="12B85259"/>
     <w:multiLevelType w:val="hybridMultilevel"/>
     <w:tmpl w:val="E8FE1C86"/>
@@ -1272,7 +3555,7 @@
       </w:rPr>
     </w:lvl>
   </w:abstractNum>
-  <w:abstractNum w:abstractNumId="2" w15:restartNumberingAfterBreak="0">
+  <w:abstractNum w:abstractNumId="4" w15:restartNumberingAfterBreak="0">
     <w:nsid w:val="160B46AD"/>
     <w:multiLevelType w:val="multilevel"/>
     <w:tmpl w:val="5CBAE796"/>
@@ -1421,7 +3704,231 @@
       </w:rPr>
     </w:lvl>
   </w:abstractNum>
-  <w:abstractNum w:abstractNumId="3" w15:restartNumberingAfterBreak="0">
+  <w:abstractNum w:abstractNumId="5" w15:restartNumberingAfterBreak="0">
+    <w:nsid w:val="1A7D7671"/>
+    <w:multiLevelType w:val="hybridMultilevel"/>
+    <w:tmpl w:val="3C701686"/>
+    <w:lvl w:ilvl="0" w:tplc="240A0001">
+      <w:start w:val="1"/>
+      <w:numFmt w:val="bullet"/>
+      <w:lvlText w:val=""/>
+      <w:lvlJc w:val="left"/>
+      <w:pPr>
+        <w:ind w:left="1080" w:hanging="360"/>
+      </w:pPr>
+      <w:rPr>
+        <w:rFonts w:ascii="Symbol" w:hAnsi="Symbol" w:hint="default"/>
+      </w:rPr>
+    </w:lvl>
+    <w:lvl w:ilvl="1" w:tplc="240A0003" w:tentative="1">
+      <w:start w:val="1"/>
+      <w:numFmt w:val="bullet"/>
+      <w:lvlText w:val="o"/>
+      <w:lvlJc w:val="left"/>
+      <w:pPr>
+        <w:ind w:left="1800" w:hanging="360"/>
+      </w:pPr>
+      <w:rPr>
+        <w:rFonts w:ascii="Courier New" w:hAnsi="Courier New" w:cs="Courier New" w:hint="default"/>
+      </w:rPr>
+    </w:lvl>
+    <w:lvl w:ilvl="2" w:tplc="240A0005" w:tentative="1">
+      <w:start w:val="1"/>
+      <w:numFmt w:val="bullet"/>
+      <w:lvlText w:val=""/>
+      <w:lvlJc w:val="left"/>
+      <w:pPr>
+        <w:ind w:left="2520" w:hanging="360"/>
+      </w:pPr>
+      <w:rPr>
+        <w:rFonts w:ascii="Wingdings" w:hAnsi="Wingdings" w:hint="default"/>
+      </w:rPr>
+    </w:lvl>
+    <w:lvl w:ilvl="3" w:tplc="240A0001" w:tentative="1">
+      <w:start w:val="1"/>
+      <w:numFmt w:val="bullet"/>
+      <w:lvlText w:val=""/>
+      <w:lvlJc w:val="left"/>
+      <w:pPr>
+        <w:ind w:left="3240" w:hanging="360"/>
+      </w:pPr>
+      <w:rPr>
+        <w:rFonts w:ascii="Symbol" w:hAnsi="Symbol" w:hint="default"/>
+      </w:rPr>
+    </w:lvl>
+    <w:lvl w:ilvl="4" w:tplc="240A0003" w:tentative="1">
+      <w:start w:val="1"/>
+      <w:numFmt w:val="bullet"/>
+      <w:lvlText w:val="o"/>
+      <w:lvlJc w:val="left"/>
+      <w:pPr>
+        <w:ind w:left="3960" w:hanging="360"/>
+      </w:pPr>
+      <w:rPr>
+        <w:rFonts w:ascii="Courier New" w:hAnsi="Courier New" w:cs="Courier New" w:hint="default"/>
+      </w:rPr>
+    </w:lvl>
+    <w:lvl w:ilvl="5" w:tplc="240A0005" w:tentative="1">
+      <w:start w:val="1"/>
+      <w:numFmt w:val="bullet"/>
+      <w:lvlText w:val=""/>
+      <w:lvlJc w:val="left"/>
+      <w:pPr>
+        <w:ind w:left="4680" w:hanging="360"/>
+      </w:pPr>
+      <w:rPr>
+        <w:rFonts w:ascii="Wingdings" w:hAnsi="Wingdings" w:hint="default"/>
+      </w:rPr>
+    </w:lvl>
+    <w:lvl w:ilvl="6" w:tplc="240A0001" w:tentative="1">
+      <w:start w:val="1"/>
+      <w:numFmt w:val="bullet"/>
+      <w:lvlText w:val=""/>
+      <w:lvlJc w:val="left"/>
+      <w:pPr>
+        <w:ind w:left="5400" w:hanging="360"/>
+      </w:pPr>
+      <w:rPr>
+        <w:rFonts w:ascii="Symbol" w:hAnsi="Symbol" w:hint="default"/>
+      </w:rPr>
+    </w:lvl>
+    <w:lvl w:ilvl="7" w:tplc="240A0003" w:tentative="1">
+      <w:start w:val="1"/>
+      <w:numFmt w:val="bullet"/>
+      <w:lvlText w:val="o"/>
+      <w:lvlJc w:val="left"/>
+      <w:pPr>
+        <w:ind w:left="6120" w:hanging="360"/>
+      </w:pPr>
+      <w:rPr>
+        <w:rFonts w:ascii="Courier New" w:hAnsi="Courier New" w:cs="Courier New" w:hint="default"/>
+      </w:rPr>
+    </w:lvl>
+    <w:lvl w:ilvl="8" w:tplc="240A0005" w:tentative="1">
+      <w:start w:val="1"/>
+      <w:numFmt w:val="bullet"/>
+      <w:lvlText w:val=""/>
+      <w:lvlJc w:val="left"/>
+      <w:pPr>
+        <w:ind w:left="6840" w:hanging="360"/>
+      </w:pPr>
+      <w:rPr>
+        <w:rFonts w:ascii="Wingdings" w:hAnsi="Wingdings" w:hint="default"/>
+      </w:rPr>
+    </w:lvl>
+  </w:abstractNum>
+  <w:abstractNum w:abstractNumId="6" w15:restartNumberingAfterBreak="0">
+    <w:nsid w:val="1A916DED"/>
+    <w:multiLevelType w:val="hybridMultilevel"/>
+    <w:tmpl w:val="E816219C"/>
+    <w:lvl w:ilvl="0" w:tplc="42288282">
+      <w:numFmt w:val="bullet"/>
+      <w:lvlText w:val="•"/>
+      <w:lvlJc w:val="left"/>
+      <w:pPr>
+        <w:ind w:left="1080" w:hanging="360"/>
+      </w:pPr>
+      <w:rPr>
+        <w:rFonts w:ascii="Times New Roman" w:eastAsia="Times New Roman" w:hAnsi="Times New Roman" w:cs="Times New Roman" w:hint="default"/>
+      </w:rPr>
+    </w:lvl>
+    <w:lvl w:ilvl="1" w:tplc="42288282">
+      <w:numFmt w:val="bullet"/>
+      <w:lvlText w:val="•"/>
+      <w:lvlJc w:val="left"/>
+      <w:pPr>
+        <w:ind w:left="1800" w:hanging="360"/>
+      </w:pPr>
+      <w:rPr>
+        <w:rFonts w:ascii="Times New Roman" w:eastAsia="Times New Roman" w:hAnsi="Times New Roman" w:cs="Times New Roman" w:hint="default"/>
+      </w:rPr>
+    </w:lvl>
+    <w:lvl w:ilvl="2" w:tplc="240A0005" w:tentative="1">
+      <w:start w:val="1"/>
+      <w:numFmt w:val="bullet"/>
+      <w:lvlText w:val=""/>
+      <w:lvlJc w:val="left"/>
+      <w:pPr>
+        <w:ind w:left="2520" w:hanging="360"/>
+      </w:pPr>
+      <w:rPr>
+        <w:rFonts w:ascii="Wingdings" w:hAnsi="Wingdings" w:hint="default"/>
+      </w:rPr>
+    </w:lvl>
+    <w:lvl w:ilvl="3" w:tplc="240A0001" w:tentative="1">
+      <w:start w:val="1"/>
+      <w:numFmt w:val="bullet"/>
+      <w:lvlText w:val=""/>
+      <w:lvlJc w:val="left"/>
+      <w:pPr>
+        <w:ind w:left="3240" w:hanging="360"/>
+      </w:pPr>
+      <w:rPr>
+        <w:rFonts w:ascii="Symbol" w:hAnsi="Symbol" w:hint="default"/>
+      </w:rPr>
+    </w:lvl>
+    <w:lvl w:ilvl="4" w:tplc="240A0003" w:tentative="1">
+      <w:start w:val="1"/>
+      <w:numFmt w:val="bullet"/>
+      <w:lvlText w:val="o"/>
+      <w:lvlJc w:val="left"/>
+      <w:pPr>
+        <w:ind w:left="3960" w:hanging="360"/>
+      </w:pPr>
+      <w:rPr>
+        <w:rFonts w:ascii="Courier New" w:hAnsi="Courier New" w:cs="Courier New" w:hint="default"/>
+      </w:rPr>
+    </w:lvl>
+    <w:lvl w:ilvl="5" w:tplc="240A0005" w:tentative="1">
+      <w:start w:val="1"/>
+      <w:numFmt w:val="bullet"/>
+      <w:lvlText w:val=""/>
+      <w:lvlJc w:val="left"/>
+      <w:pPr>
+        <w:ind w:left="4680" w:hanging="360"/>
+      </w:pPr>
+      <w:rPr>
+        <w:rFonts w:ascii="Wingdings" w:hAnsi="Wingdings" w:hint="default"/>
+      </w:rPr>
+    </w:lvl>
+    <w:lvl w:ilvl="6" w:tplc="240A0001" w:tentative="1">
+      <w:start w:val="1"/>
+      <w:numFmt w:val="bullet"/>
+      <w:lvlText w:val=""/>
+      <w:lvlJc w:val="left"/>
+      <w:pPr>
+        <w:ind w:left="5400" w:hanging="360"/>
+      </w:pPr>
+      <w:rPr>
+        <w:rFonts w:ascii="Symbol" w:hAnsi="Symbol" w:hint="default"/>
+      </w:rPr>
+    </w:lvl>
+    <w:lvl w:ilvl="7" w:tplc="240A0003" w:tentative="1">
+      <w:start w:val="1"/>
+      <w:numFmt w:val="bullet"/>
+      <w:lvlText w:val="o"/>
+      <w:lvlJc w:val="left"/>
+      <w:pPr>
+        <w:ind w:left="6120" w:hanging="360"/>
+      </w:pPr>
+      <w:rPr>
+        <w:rFonts w:ascii="Courier New" w:hAnsi="Courier New" w:cs="Courier New" w:hint="default"/>
+      </w:rPr>
+    </w:lvl>
+    <w:lvl w:ilvl="8" w:tplc="240A0005" w:tentative="1">
+      <w:start w:val="1"/>
+      <w:numFmt w:val="bullet"/>
+      <w:lvlText w:val=""/>
+      <w:lvlJc w:val="left"/>
+      <w:pPr>
+        <w:ind w:left="6840" w:hanging="360"/>
+      </w:pPr>
+      <w:rPr>
+        <w:rFonts w:ascii="Wingdings" w:hAnsi="Wingdings" w:hint="default"/>
+      </w:rPr>
+    </w:lvl>
+  </w:abstractNum>
+  <w:abstractNum w:abstractNumId="7" w15:restartNumberingAfterBreak="0">
     <w:nsid w:val="1FF94194"/>
     <w:multiLevelType w:val="multilevel"/>
     <w:tmpl w:val="0E8C5DDA"/>
@@ -1570,7 +4077,119 @@
       </w:rPr>
     </w:lvl>
   </w:abstractNum>
-  <w:abstractNum w:abstractNumId="4" w15:restartNumberingAfterBreak="0">
+  <w:abstractNum w:abstractNumId="8" w15:restartNumberingAfterBreak="0">
+    <w:nsid w:val="243E0864"/>
+    <w:multiLevelType w:val="hybridMultilevel"/>
+    <w:tmpl w:val="1FF07D0A"/>
+    <w:lvl w:ilvl="0" w:tplc="42288282">
+      <w:numFmt w:val="bullet"/>
+      <w:lvlText w:val="•"/>
+      <w:lvlJc w:val="left"/>
+      <w:pPr>
+        <w:ind w:left="1080" w:hanging="360"/>
+      </w:pPr>
+      <w:rPr>
+        <w:rFonts w:ascii="Times New Roman" w:eastAsia="Times New Roman" w:hAnsi="Times New Roman" w:cs="Times New Roman" w:hint="default"/>
+      </w:rPr>
+    </w:lvl>
+    <w:lvl w:ilvl="1" w:tplc="240A0003" w:tentative="1">
+      <w:start w:val="1"/>
+      <w:numFmt w:val="bullet"/>
+      <w:lvlText w:val="o"/>
+      <w:lvlJc w:val="left"/>
+      <w:pPr>
+        <w:ind w:left="1800" w:hanging="360"/>
+      </w:pPr>
+      <w:rPr>
+        <w:rFonts w:ascii="Courier New" w:hAnsi="Courier New" w:cs="Courier New" w:hint="default"/>
+      </w:rPr>
+    </w:lvl>
+    <w:lvl w:ilvl="2" w:tplc="240A0005" w:tentative="1">
+      <w:start w:val="1"/>
+      <w:numFmt w:val="bullet"/>
+      <w:lvlText w:val=""/>
+      <w:lvlJc w:val="left"/>
+      <w:pPr>
+        <w:ind w:left="2520" w:hanging="360"/>
+      </w:pPr>
+      <w:rPr>
+        <w:rFonts w:ascii="Wingdings" w:hAnsi="Wingdings" w:hint="default"/>
+      </w:rPr>
+    </w:lvl>
+    <w:lvl w:ilvl="3" w:tplc="240A0001" w:tentative="1">
+      <w:start w:val="1"/>
+      <w:numFmt w:val="bullet"/>
+      <w:lvlText w:val=""/>
+      <w:lvlJc w:val="left"/>
+      <w:pPr>
+        <w:ind w:left="3240" w:hanging="360"/>
+      </w:pPr>
+      <w:rPr>
+        <w:rFonts w:ascii="Symbol" w:hAnsi="Symbol" w:hint="default"/>
+      </w:rPr>
+    </w:lvl>
+    <w:lvl w:ilvl="4" w:tplc="240A0003" w:tentative="1">
+      <w:start w:val="1"/>
+      <w:numFmt w:val="bullet"/>
+      <w:lvlText w:val="o"/>
+      <w:lvlJc w:val="left"/>
+      <w:pPr>
+        <w:ind w:left="3960" w:hanging="360"/>
+      </w:pPr>
+      <w:rPr>
+        <w:rFonts w:ascii="Courier New" w:hAnsi="Courier New" w:cs="Courier New" w:hint="default"/>
+      </w:rPr>
+    </w:lvl>
+    <w:lvl w:ilvl="5" w:tplc="240A0005" w:tentative="1">
+      <w:start w:val="1"/>
+      <w:numFmt w:val="bullet"/>
+      <w:lvlText w:val=""/>
+      <w:lvlJc w:val="left"/>
+      <w:pPr>
+        <w:ind w:left="4680" w:hanging="360"/>
+      </w:pPr>
+      <w:rPr>
+        <w:rFonts w:ascii="Wingdings" w:hAnsi="Wingdings" w:hint="default"/>
+      </w:rPr>
+    </w:lvl>
+    <w:lvl w:ilvl="6" w:tplc="240A0001" w:tentative="1">
+      <w:start w:val="1"/>
+      <w:numFmt w:val="bullet"/>
+      <w:lvlText w:val=""/>
+      <w:lvlJc w:val="left"/>
+      <w:pPr>
+        <w:ind w:left="5400" w:hanging="360"/>
+      </w:pPr>
+      <w:rPr>
+        <w:rFonts w:ascii="Symbol" w:hAnsi="Symbol" w:hint="default"/>
+      </w:rPr>
+    </w:lvl>
+    <w:lvl w:ilvl="7" w:tplc="240A0003" w:tentative="1">
+      <w:start w:val="1"/>
+      <w:numFmt w:val="bullet"/>
+      <w:lvlText w:val="o"/>
+      <w:lvlJc w:val="left"/>
+      <w:pPr>
+        <w:ind w:left="6120" w:hanging="360"/>
+      </w:pPr>
+      <w:rPr>
+        <w:rFonts w:ascii="Courier New" w:hAnsi="Courier New" w:cs="Courier New" w:hint="default"/>
+      </w:rPr>
+    </w:lvl>
+    <w:lvl w:ilvl="8" w:tplc="240A0005" w:tentative="1">
+      <w:start w:val="1"/>
+      <w:numFmt w:val="bullet"/>
+      <w:lvlText w:val=""/>
+      <w:lvlJc w:val="left"/>
+      <w:pPr>
+        <w:ind w:left="6840" w:hanging="360"/>
+      </w:pPr>
+      <w:rPr>
+        <w:rFonts w:ascii="Wingdings" w:hAnsi="Wingdings" w:hint="default"/>
+      </w:rPr>
+    </w:lvl>
+  </w:abstractNum>
+  <w:abstractNum w:abstractNumId="9" w15:restartNumberingAfterBreak="0">
     <w:nsid w:val="24854A4B"/>
     <w:multiLevelType w:val="multilevel"/>
     <w:tmpl w:val="B32C448A"/>
@@ -1656,7 +4275,382 @@
       </w:pPr>
     </w:lvl>
   </w:abstractNum>
-  <w:abstractNum w:abstractNumId="5" w15:restartNumberingAfterBreak="0">
+  <w:abstractNum w:abstractNumId="10" w15:restartNumberingAfterBreak="0">
+    <w:nsid w:val="279C43BE"/>
+    <w:multiLevelType w:val="multilevel"/>
+    <w:tmpl w:val="28EAF224"/>
+    <w:lvl w:ilvl="0">
+      <w:start w:val="1"/>
+      <w:numFmt w:val="decimal"/>
+      <w:lvlText w:val="%1."/>
+      <w:lvlJc w:val="left"/>
+      <w:pPr>
+        <w:tabs>
+          <w:tab w:val="num" w:pos="720"/>
+        </w:tabs>
+        <w:ind w:left="720" w:hanging="360"/>
+      </w:pPr>
+    </w:lvl>
+    <w:lvl w:ilvl="1" w:tentative="1">
+      <w:start w:val="1"/>
+      <w:numFmt w:val="decimal"/>
+      <w:lvlText w:val="%2."/>
+      <w:lvlJc w:val="left"/>
+      <w:pPr>
+        <w:tabs>
+          <w:tab w:val="num" w:pos="1440"/>
+        </w:tabs>
+        <w:ind w:left="1440" w:hanging="360"/>
+      </w:pPr>
+    </w:lvl>
+    <w:lvl w:ilvl="2" w:tentative="1">
+      <w:start w:val="1"/>
+      <w:numFmt w:val="decimal"/>
+      <w:lvlText w:val="%3."/>
+      <w:lvlJc w:val="left"/>
+      <w:pPr>
+        <w:tabs>
+          <w:tab w:val="num" w:pos="2160"/>
+        </w:tabs>
+        <w:ind w:left="2160" w:hanging="360"/>
+      </w:pPr>
+    </w:lvl>
+    <w:lvl w:ilvl="3" w:tentative="1">
+      <w:start w:val="1"/>
+      <w:numFmt w:val="decimal"/>
+      <w:lvlText w:val="%4."/>
+      <w:lvlJc w:val="left"/>
+      <w:pPr>
+        <w:tabs>
+          <w:tab w:val="num" w:pos="2880"/>
+        </w:tabs>
+        <w:ind w:left="2880" w:hanging="360"/>
+      </w:pPr>
+    </w:lvl>
+    <w:lvl w:ilvl="4" w:tentative="1">
+      <w:start w:val="1"/>
+      <w:numFmt w:val="decimal"/>
+      <w:lvlText w:val="%5."/>
+      <w:lvlJc w:val="left"/>
+      <w:pPr>
+        <w:tabs>
+          <w:tab w:val="num" w:pos="3600"/>
+        </w:tabs>
+        <w:ind w:left="3600" w:hanging="360"/>
+      </w:pPr>
+    </w:lvl>
+    <w:lvl w:ilvl="5" w:tentative="1">
+      <w:start w:val="1"/>
+      <w:numFmt w:val="decimal"/>
+      <w:lvlText w:val="%6."/>
+      <w:lvlJc w:val="left"/>
+      <w:pPr>
+        <w:tabs>
+          <w:tab w:val="num" w:pos="4320"/>
+        </w:tabs>
+        <w:ind w:left="4320" w:hanging="360"/>
+      </w:pPr>
+    </w:lvl>
+    <w:lvl w:ilvl="6" w:tentative="1">
+      <w:start w:val="1"/>
+      <w:numFmt w:val="decimal"/>
+      <w:lvlText w:val="%7."/>
+      <w:lvlJc w:val="left"/>
+      <w:pPr>
+        <w:tabs>
+          <w:tab w:val="num" w:pos="5040"/>
+        </w:tabs>
+        <w:ind w:left="5040" w:hanging="360"/>
+      </w:pPr>
+    </w:lvl>
+    <w:lvl w:ilvl="7" w:tentative="1">
+      <w:start w:val="1"/>
+      <w:numFmt w:val="decimal"/>
+      <w:lvlText w:val="%8."/>
+      <w:lvlJc w:val="left"/>
+      <w:pPr>
+        <w:tabs>
+          <w:tab w:val="num" w:pos="5760"/>
+        </w:tabs>
+        <w:ind w:left="5760" w:hanging="360"/>
+      </w:pPr>
+    </w:lvl>
+    <w:lvl w:ilvl="8" w:tentative="1">
+      <w:start w:val="1"/>
+      <w:numFmt w:val="decimal"/>
+      <w:lvlText w:val="%9."/>
+      <w:lvlJc w:val="left"/>
+      <w:pPr>
+        <w:tabs>
+          <w:tab w:val="num" w:pos="6480"/>
+        </w:tabs>
+        <w:ind w:left="6480" w:hanging="360"/>
+      </w:pPr>
+    </w:lvl>
+  </w:abstractNum>
+  <w:abstractNum w:abstractNumId="11" w15:restartNumberingAfterBreak="0">
+    <w:nsid w:val="305F6C9D"/>
+    <w:multiLevelType w:val="multilevel"/>
+    <w:tmpl w:val="218C559A"/>
+    <w:lvl w:ilvl="0">
+      <w:start w:val="1"/>
+      <w:numFmt w:val="bullet"/>
+      <w:lvlText w:val=""/>
+      <w:lvlJc w:val="left"/>
+      <w:pPr>
+        <w:tabs>
+          <w:tab w:val="num" w:pos="720"/>
+        </w:tabs>
+        <w:ind w:left="720" w:hanging="360"/>
+      </w:pPr>
+      <w:rPr>
+        <w:rFonts w:ascii="Symbol" w:hAnsi="Symbol" w:hint="default"/>
+        <w:sz w:val="20"/>
+      </w:rPr>
+    </w:lvl>
+    <w:lvl w:ilvl="1">
+      <w:start w:val="1"/>
+      <w:numFmt w:val="bullet"/>
+      <w:lvlText w:val="o"/>
+      <w:lvlJc w:val="left"/>
+      <w:pPr>
+        <w:tabs>
+          <w:tab w:val="num" w:pos="1440"/>
+        </w:tabs>
+        <w:ind w:left="1440" w:hanging="360"/>
+      </w:pPr>
+      <w:rPr>
+        <w:rFonts w:ascii="Courier New" w:hAnsi="Courier New" w:hint="default"/>
+        <w:sz w:val="20"/>
+      </w:rPr>
+    </w:lvl>
+    <w:lvl w:ilvl="2" w:tentative="1">
+      <w:start w:val="1"/>
+      <w:numFmt w:val="bullet"/>
+      <w:lvlText w:val=""/>
+      <w:lvlJc w:val="left"/>
+      <w:pPr>
+        <w:tabs>
+          <w:tab w:val="num" w:pos="2160"/>
+        </w:tabs>
+        <w:ind w:left="2160" w:hanging="360"/>
+      </w:pPr>
+      <w:rPr>
+        <w:rFonts w:ascii="Wingdings" w:hAnsi="Wingdings" w:hint="default"/>
+        <w:sz w:val="20"/>
+      </w:rPr>
+    </w:lvl>
+    <w:lvl w:ilvl="3" w:tentative="1">
+      <w:start w:val="1"/>
+      <w:numFmt w:val="bullet"/>
+      <w:lvlText w:val=""/>
+      <w:lvlJc w:val="left"/>
+      <w:pPr>
+        <w:tabs>
+          <w:tab w:val="num" w:pos="2880"/>
+        </w:tabs>
+        <w:ind w:left="2880" w:hanging="360"/>
+      </w:pPr>
+      <w:rPr>
+        <w:rFonts w:ascii="Wingdings" w:hAnsi="Wingdings" w:hint="default"/>
+        <w:sz w:val="20"/>
+      </w:rPr>
+    </w:lvl>
+    <w:lvl w:ilvl="4" w:tentative="1">
+      <w:start w:val="1"/>
+      <w:numFmt w:val="bullet"/>
+      <w:lvlText w:val=""/>
+      <w:lvlJc w:val="left"/>
+      <w:pPr>
+        <w:tabs>
+          <w:tab w:val="num" w:pos="3600"/>
+        </w:tabs>
+        <w:ind w:left="3600" w:hanging="360"/>
+      </w:pPr>
+      <w:rPr>
+        <w:rFonts w:ascii="Wingdings" w:hAnsi="Wingdings" w:hint="default"/>
+        <w:sz w:val="20"/>
+      </w:rPr>
+    </w:lvl>
+    <w:lvl w:ilvl="5" w:tentative="1">
+      <w:start w:val="1"/>
+      <w:numFmt w:val="bullet"/>
+      <w:lvlText w:val=""/>
+      <w:lvlJc w:val="left"/>
+      <w:pPr>
+        <w:tabs>
+          <w:tab w:val="num" w:pos="4320"/>
+        </w:tabs>
+        <w:ind w:left="4320" w:hanging="360"/>
+      </w:pPr>
+      <w:rPr>
+        <w:rFonts w:ascii="Wingdings" w:hAnsi="Wingdings" w:hint="default"/>
+        <w:sz w:val="20"/>
+      </w:rPr>
+    </w:lvl>
+    <w:lvl w:ilvl="6" w:tentative="1">
+      <w:start w:val="1"/>
+      <w:numFmt w:val="bullet"/>
+      <w:lvlText w:val=""/>
+      <w:lvlJc w:val="left"/>
+      <w:pPr>
+        <w:tabs>
+          <w:tab w:val="num" w:pos="5040"/>
+        </w:tabs>
+        <w:ind w:left="5040" w:hanging="360"/>
+      </w:pPr>
+      <w:rPr>
+        <w:rFonts w:ascii="Wingdings" w:hAnsi="Wingdings" w:hint="default"/>
+        <w:sz w:val="20"/>
+      </w:rPr>
+    </w:lvl>
+    <w:lvl w:ilvl="7" w:tentative="1">
+      <w:start w:val="1"/>
+      <w:numFmt w:val="bullet"/>
+      <w:lvlText w:val=""/>
+      <w:lvlJc w:val="left"/>
+      <w:pPr>
+        <w:tabs>
+          <w:tab w:val="num" w:pos="5760"/>
+        </w:tabs>
+        <w:ind w:left="5760" w:hanging="360"/>
+      </w:pPr>
+      <w:rPr>
+        <w:rFonts w:ascii="Wingdings" w:hAnsi="Wingdings" w:hint="default"/>
+        <w:sz w:val="20"/>
+      </w:rPr>
+    </w:lvl>
+    <w:lvl w:ilvl="8" w:tentative="1">
+      <w:start w:val="1"/>
+      <w:numFmt w:val="bullet"/>
+      <w:lvlText w:val=""/>
+      <w:lvlJc w:val="left"/>
+      <w:pPr>
+        <w:tabs>
+          <w:tab w:val="num" w:pos="6480"/>
+        </w:tabs>
+        <w:ind w:left="6480" w:hanging="360"/>
+      </w:pPr>
+      <w:rPr>
+        <w:rFonts w:ascii="Wingdings" w:hAnsi="Wingdings" w:hint="default"/>
+        <w:sz w:val="20"/>
+      </w:rPr>
+    </w:lvl>
+  </w:abstractNum>
+  <w:abstractNum w:abstractNumId="12" w15:restartNumberingAfterBreak="0">
+    <w:nsid w:val="321E6A5E"/>
+    <w:multiLevelType w:val="multilevel"/>
+    <w:tmpl w:val="B04C092C"/>
+    <w:lvl w:ilvl="0">
+      <w:start w:val="1"/>
+      <w:numFmt w:val="decimal"/>
+      <w:lvlText w:val="%1."/>
+      <w:lvlJc w:val="left"/>
+      <w:pPr>
+        <w:tabs>
+          <w:tab w:val="num" w:pos="720"/>
+        </w:tabs>
+        <w:ind w:left="720" w:hanging="360"/>
+      </w:pPr>
+    </w:lvl>
+    <w:lvl w:ilvl="1" w:tentative="1">
+      <w:start w:val="1"/>
+      <w:numFmt w:val="decimal"/>
+      <w:lvlText w:val="%2."/>
+      <w:lvlJc w:val="left"/>
+      <w:pPr>
+        <w:tabs>
+          <w:tab w:val="num" w:pos="1440"/>
+        </w:tabs>
+        <w:ind w:left="1440" w:hanging="360"/>
+      </w:pPr>
+    </w:lvl>
+    <w:lvl w:ilvl="2" w:tentative="1">
+      <w:start w:val="1"/>
+      <w:numFmt w:val="decimal"/>
+      <w:lvlText w:val="%3."/>
+      <w:lvlJc w:val="left"/>
+      <w:pPr>
+        <w:tabs>
+          <w:tab w:val="num" w:pos="2160"/>
+        </w:tabs>
+        <w:ind w:left="2160" w:hanging="360"/>
+      </w:pPr>
+    </w:lvl>
+    <w:lvl w:ilvl="3" w:tentative="1">
+      <w:start w:val="1"/>
+      <w:numFmt w:val="decimal"/>
+      <w:lvlText w:val="%4."/>
+      <w:lvlJc w:val="left"/>
+      <w:pPr>
+        <w:tabs>
+          <w:tab w:val="num" w:pos="2880"/>
+        </w:tabs>
+        <w:ind w:left="2880" w:hanging="360"/>
+      </w:pPr>
+    </w:lvl>
+    <w:lvl w:ilvl="4" w:tentative="1">
+      <w:start w:val="1"/>
+      <w:numFmt w:val="decimal"/>
+      <w:lvlText w:val="%5."/>
+      <w:lvlJc w:val="left"/>
+      <w:pPr>
+        <w:tabs>
+          <w:tab w:val="num" w:pos="3600"/>
+        </w:tabs>
+        <w:ind w:left="3600" w:hanging="360"/>
+      </w:pPr>
+    </w:lvl>
+    <w:lvl w:ilvl="5" w:tentative="1">
+      <w:start w:val="1"/>
+      <w:numFmt w:val="decimal"/>
+      <w:lvlText w:val="%6."/>
+      <w:lvlJc w:val="left"/>
+      <w:pPr>
+        <w:tabs>
+          <w:tab w:val="num" w:pos="4320"/>
+        </w:tabs>
+        <w:ind w:left="4320" w:hanging="360"/>
+      </w:pPr>
+    </w:lvl>
+    <w:lvl w:ilvl="6" w:tentative="1">
+      <w:start w:val="1"/>
+      <w:numFmt w:val="decimal"/>
+      <w:lvlText w:val="%7."/>
+      <w:lvlJc w:val="left"/>
+      <w:pPr>
+        <w:tabs>
+          <w:tab w:val="num" w:pos="5040"/>
+        </w:tabs>
+        <w:ind w:left="5040" w:hanging="360"/>
+      </w:pPr>
+    </w:lvl>
+    <w:lvl w:ilvl="7" w:tentative="1">
+      <w:start w:val="1"/>
+      <w:numFmt w:val="decimal"/>
+      <w:lvlText w:val="%8."/>
+      <w:lvlJc w:val="left"/>
+      <w:pPr>
+        <w:tabs>
+          <w:tab w:val="num" w:pos="5760"/>
+        </w:tabs>
+        <w:ind w:left="5760" w:hanging="360"/>
+      </w:pPr>
+    </w:lvl>
+    <w:lvl w:ilvl="8" w:tentative="1">
+      <w:start w:val="1"/>
+      <w:numFmt w:val="decimal"/>
+      <w:lvlText w:val="%9."/>
+      <w:lvlJc w:val="left"/>
+      <w:pPr>
+        <w:tabs>
+          <w:tab w:val="num" w:pos="6480"/>
+        </w:tabs>
+        <w:ind w:left="6480" w:hanging="360"/>
+      </w:pPr>
+    </w:lvl>
+  </w:abstractNum>
+  <w:abstractNum w:abstractNumId="13" w15:restartNumberingAfterBreak="0">
     <w:nsid w:val="352E5714"/>
     <w:multiLevelType w:val="multilevel"/>
     <w:tmpl w:val="B24EDE3E"/>
@@ -1805,7 +4799,7 @@
       </w:rPr>
     </w:lvl>
   </w:abstractNum>
-  <w:abstractNum w:abstractNumId="6" w15:restartNumberingAfterBreak="0">
+  <w:abstractNum w:abstractNumId="14" w15:restartNumberingAfterBreak="0">
     <w:nsid w:val="3AB86CDA"/>
     <w:multiLevelType w:val="multilevel"/>
     <w:tmpl w:val="4C78F516"/>
@@ -1954,7 +4948,7 @@
       </w:rPr>
     </w:lvl>
   </w:abstractNum>
-  <w:abstractNum w:abstractNumId="7" w15:restartNumberingAfterBreak="0">
+  <w:abstractNum w:abstractNumId="15" w15:restartNumberingAfterBreak="0">
     <w:nsid w:val="3B086BCD"/>
     <w:multiLevelType w:val="hybridMultilevel"/>
     <w:tmpl w:val="76D43B7E"/>
@@ -2044,7 +5038,7 @@
       </w:pPr>
     </w:lvl>
   </w:abstractNum>
-  <w:abstractNum w:abstractNumId="8" w15:restartNumberingAfterBreak="0">
+  <w:abstractNum w:abstractNumId="16" w15:restartNumberingAfterBreak="0">
     <w:nsid w:val="3C0F4EF1"/>
     <w:multiLevelType w:val="multilevel"/>
     <w:tmpl w:val="6C4C0DA4"/>
@@ -2193,7 +5187,231 @@
       </w:rPr>
     </w:lvl>
   </w:abstractNum>
-  <w:abstractNum w:abstractNumId="9" w15:restartNumberingAfterBreak="0">
+  <w:abstractNum w:abstractNumId="17" w15:restartNumberingAfterBreak="0">
+    <w:nsid w:val="47694EB8"/>
+    <w:multiLevelType w:val="hybridMultilevel"/>
+    <w:tmpl w:val="7FCC190C"/>
+    <w:lvl w:ilvl="0" w:tplc="42288282">
+      <w:numFmt w:val="bullet"/>
+      <w:lvlText w:val="•"/>
+      <w:lvlJc w:val="left"/>
+      <w:pPr>
+        <w:ind w:left="720" w:hanging="360"/>
+      </w:pPr>
+      <w:rPr>
+        <w:rFonts w:ascii="Times New Roman" w:eastAsia="Times New Roman" w:hAnsi="Times New Roman" w:cs="Times New Roman" w:hint="default"/>
+      </w:rPr>
+    </w:lvl>
+    <w:lvl w:ilvl="1" w:tplc="42288282">
+      <w:numFmt w:val="bullet"/>
+      <w:lvlText w:val="•"/>
+      <w:lvlJc w:val="left"/>
+      <w:pPr>
+        <w:ind w:left="1440" w:hanging="360"/>
+      </w:pPr>
+      <w:rPr>
+        <w:rFonts w:ascii="Times New Roman" w:eastAsia="Times New Roman" w:hAnsi="Times New Roman" w:cs="Times New Roman" w:hint="default"/>
+      </w:rPr>
+    </w:lvl>
+    <w:lvl w:ilvl="2" w:tplc="240A0005" w:tentative="1">
+      <w:start w:val="1"/>
+      <w:numFmt w:val="bullet"/>
+      <w:lvlText w:val=""/>
+      <w:lvlJc w:val="left"/>
+      <w:pPr>
+        <w:ind w:left="2160" w:hanging="360"/>
+      </w:pPr>
+      <w:rPr>
+        <w:rFonts w:ascii="Wingdings" w:hAnsi="Wingdings" w:hint="default"/>
+      </w:rPr>
+    </w:lvl>
+    <w:lvl w:ilvl="3" w:tplc="240A0001" w:tentative="1">
+      <w:start w:val="1"/>
+      <w:numFmt w:val="bullet"/>
+      <w:lvlText w:val=""/>
+      <w:lvlJc w:val="left"/>
+      <w:pPr>
+        <w:ind w:left="2880" w:hanging="360"/>
+      </w:pPr>
+      <w:rPr>
+        <w:rFonts w:ascii="Symbol" w:hAnsi="Symbol" w:hint="default"/>
+      </w:rPr>
+    </w:lvl>
+    <w:lvl w:ilvl="4" w:tplc="240A0003" w:tentative="1">
+      <w:start w:val="1"/>
+      <w:numFmt w:val="bullet"/>
+      <w:lvlText w:val="o"/>
+      <w:lvlJc w:val="left"/>
+      <w:pPr>
+        <w:ind w:left="3600" w:hanging="360"/>
+      </w:pPr>
+      <w:rPr>
+        <w:rFonts w:ascii="Courier New" w:hAnsi="Courier New" w:cs="Courier New" w:hint="default"/>
+      </w:rPr>
+    </w:lvl>
+    <w:lvl w:ilvl="5" w:tplc="240A0005" w:tentative="1">
+      <w:start w:val="1"/>
+      <w:numFmt w:val="bullet"/>
+      <w:lvlText w:val=""/>
+      <w:lvlJc w:val="left"/>
+      <w:pPr>
+        <w:ind w:left="4320" w:hanging="360"/>
+      </w:pPr>
+      <w:rPr>
+        <w:rFonts w:ascii="Wingdings" w:hAnsi="Wingdings" w:hint="default"/>
+      </w:rPr>
+    </w:lvl>
+    <w:lvl w:ilvl="6" w:tplc="240A0001" w:tentative="1">
+      <w:start w:val="1"/>
+      <w:numFmt w:val="bullet"/>
+      <w:lvlText w:val=""/>
+      <w:lvlJc w:val="left"/>
+      <w:pPr>
+        <w:ind w:left="5040" w:hanging="360"/>
+      </w:pPr>
+      <w:rPr>
+        <w:rFonts w:ascii="Symbol" w:hAnsi="Symbol" w:hint="default"/>
+      </w:rPr>
+    </w:lvl>
+    <w:lvl w:ilvl="7" w:tplc="240A0003" w:tentative="1">
+      <w:start w:val="1"/>
+      <w:numFmt w:val="bullet"/>
+      <w:lvlText w:val="o"/>
+      <w:lvlJc w:val="left"/>
+      <w:pPr>
+        <w:ind w:left="5760" w:hanging="360"/>
+      </w:pPr>
+      <w:rPr>
+        <w:rFonts w:ascii="Courier New" w:hAnsi="Courier New" w:cs="Courier New" w:hint="default"/>
+      </w:rPr>
+    </w:lvl>
+    <w:lvl w:ilvl="8" w:tplc="240A0005" w:tentative="1">
+      <w:start w:val="1"/>
+      <w:numFmt w:val="bullet"/>
+      <w:lvlText w:val=""/>
+      <w:lvlJc w:val="left"/>
+      <w:pPr>
+        <w:ind w:left="6480" w:hanging="360"/>
+      </w:pPr>
+      <w:rPr>
+        <w:rFonts w:ascii="Wingdings" w:hAnsi="Wingdings" w:hint="default"/>
+      </w:rPr>
+    </w:lvl>
+  </w:abstractNum>
+  <w:abstractNum w:abstractNumId="18" w15:restartNumberingAfterBreak="0">
+    <w:nsid w:val="58CC4EE1"/>
+    <w:multiLevelType w:val="multilevel"/>
+    <w:tmpl w:val="A21A32A4"/>
+    <w:lvl w:ilvl="0">
+      <w:start w:val="1"/>
+      <w:numFmt w:val="decimal"/>
+      <w:lvlText w:val="%1."/>
+      <w:lvlJc w:val="left"/>
+      <w:pPr>
+        <w:tabs>
+          <w:tab w:val="num" w:pos="720"/>
+        </w:tabs>
+        <w:ind w:left="720" w:hanging="360"/>
+      </w:pPr>
+    </w:lvl>
+    <w:lvl w:ilvl="1" w:tentative="1">
+      <w:start w:val="1"/>
+      <w:numFmt w:val="decimal"/>
+      <w:lvlText w:val="%2."/>
+      <w:lvlJc w:val="left"/>
+      <w:pPr>
+        <w:tabs>
+          <w:tab w:val="num" w:pos="1440"/>
+        </w:tabs>
+        <w:ind w:left="1440" w:hanging="360"/>
+      </w:pPr>
+    </w:lvl>
+    <w:lvl w:ilvl="2" w:tentative="1">
+      <w:start w:val="1"/>
+      <w:numFmt w:val="decimal"/>
+      <w:lvlText w:val="%3."/>
+      <w:lvlJc w:val="left"/>
+      <w:pPr>
+        <w:tabs>
+          <w:tab w:val="num" w:pos="2160"/>
+        </w:tabs>
+        <w:ind w:left="2160" w:hanging="360"/>
+      </w:pPr>
+    </w:lvl>
+    <w:lvl w:ilvl="3" w:tentative="1">
+      <w:start w:val="1"/>
+      <w:numFmt w:val="decimal"/>
+      <w:lvlText w:val="%4."/>
+      <w:lvlJc w:val="left"/>
+      <w:pPr>
+        <w:tabs>
+          <w:tab w:val="num" w:pos="2880"/>
+        </w:tabs>
+        <w:ind w:left="2880" w:hanging="360"/>
+      </w:pPr>
+    </w:lvl>
+    <w:lvl w:ilvl="4" w:tentative="1">
+      <w:start w:val="1"/>
+      <w:numFmt w:val="decimal"/>
+      <w:lvlText w:val="%5."/>
+      <w:lvlJc w:val="left"/>
+      <w:pPr>
+        <w:tabs>
+          <w:tab w:val="num" w:pos="3600"/>
+        </w:tabs>
+        <w:ind w:left="3600" w:hanging="360"/>
+      </w:pPr>
+    </w:lvl>
+    <w:lvl w:ilvl="5" w:tentative="1">
+      <w:start w:val="1"/>
+      <w:numFmt w:val="decimal"/>
+      <w:lvlText w:val="%6."/>
+      <w:lvlJc w:val="left"/>
+      <w:pPr>
+        <w:tabs>
+          <w:tab w:val="num" w:pos="4320"/>
+        </w:tabs>
+        <w:ind w:left="4320" w:hanging="360"/>
+      </w:pPr>
+    </w:lvl>
+    <w:lvl w:ilvl="6" w:tentative="1">
+      <w:start w:val="1"/>
+      <w:numFmt w:val="decimal"/>
+      <w:lvlText w:val="%7."/>
+      <w:lvlJc w:val="left"/>
+      <w:pPr>
+        <w:tabs>
+          <w:tab w:val="num" w:pos="5040"/>
+        </w:tabs>
+        <w:ind w:left="5040" w:hanging="360"/>
+      </w:pPr>
+    </w:lvl>
+    <w:lvl w:ilvl="7" w:tentative="1">
+      <w:start w:val="1"/>
+      <w:numFmt w:val="decimal"/>
+      <w:lvlText w:val="%8."/>
+      <w:lvlJc w:val="left"/>
+      <w:pPr>
+        <w:tabs>
+          <w:tab w:val="num" w:pos="5760"/>
+        </w:tabs>
+        <w:ind w:left="5760" w:hanging="360"/>
+      </w:pPr>
+    </w:lvl>
+    <w:lvl w:ilvl="8" w:tentative="1">
+      <w:start w:val="1"/>
+      <w:numFmt w:val="decimal"/>
+      <w:lvlText w:val="%9."/>
+      <w:lvlJc w:val="left"/>
+      <w:pPr>
+        <w:tabs>
+          <w:tab w:val="num" w:pos="6480"/>
+        </w:tabs>
+        <w:ind w:left="6480" w:hanging="360"/>
+      </w:pPr>
+    </w:lvl>
+  </w:abstractNum>
+  <w:abstractNum w:abstractNumId="19" w15:restartNumberingAfterBreak="0">
     <w:nsid w:val="5BFC14E9"/>
     <w:multiLevelType w:val="hybridMultilevel"/>
     <w:tmpl w:val="B65EA666"/>
@@ -2279,7 +5497,7 @@
       </w:pPr>
     </w:lvl>
   </w:abstractNum>
-  <w:abstractNum w:abstractNumId="10" w15:restartNumberingAfterBreak="0">
+  <w:abstractNum w:abstractNumId="20" w15:restartNumberingAfterBreak="0">
     <w:nsid w:val="5CFF6772"/>
     <w:multiLevelType w:val="multilevel"/>
     <w:tmpl w:val="993656B6"/>
@@ -2428,7 +5646,7 @@
       </w:rPr>
     </w:lvl>
   </w:abstractNum>
-  <w:abstractNum w:abstractNumId="11" w15:restartNumberingAfterBreak="0">
+  <w:abstractNum w:abstractNumId="21" w15:restartNumberingAfterBreak="0">
     <w:nsid w:val="606D7DFB"/>
     <w:multiLevelType w:val="hybridMultilevel"/>
     <w:tmpl w:val="99561686"/>
@@ -2518,7 +5736,93 @@
       </w:pPr>
     </w:lvl>
   </w:abstractNum>
-  <w:abstractNum w:abstractNumId="12" w15:restartNumberingAfterBreak="0">
+  <w:abstractNum w:abstractNumId="22" w15:restartNumberingAfterBreak="0">
+    <w:nsid w:val="64C05C73"/>
+    <w:multiLevelType w:val="hybridMultilevel"/>
+    <w:tmpl w:val="0074A1AC"/>
+    <w:lvl w:ilvl="0" w:tplc="240A000F">
+      <w:start w:val="1"/>
+      <w:numFmt w:val="decimal"/>
+      <w:lvlText w:val="%1."/>
+      <w:lvlJc w:val="left"/>
+      <w:pPr>
+        <w:ind w:left="360" w:hanging="360"/>
+      </w:pPr>
+    </w:lvl>
+    <w:lvl w:ilvl="1" w:tplc="240A0019" w:tentative="1">
+      <w:start w:val="1"/>
+      <w:numFmt w:val="lowerLetter"/>
+      <w:lvlText w:val="%2."/>
+      <w:lvlJc w:val="left"/>
+      <w:pPr>
+        <w:ind w:left="1080" w:hanging="360"/>
+      </w:pPr>
+    </w:lvl>
+    <w:lvl w:ilvl="2" w:tplc="240A001B" w:tentative="1">
+      <w:start w:val="1"/>
+      <w:numFmt w:val="lowerRoman"/>
+      <w:lvlText w:val="%3."/>
+      <w:lvlJc w:val="right"/>
+      <w:pPr>
+        <w:ind w:left="1800" w:hanging="180"/>
+      </w:pPr>
+    </w:lvl>
+    <w:lvl w:ilvl="3" w:tplc="240A000F" w:tentative="1">
+      <w:start w:val="1"/>
+      <w:numFmt w:val="decimal"/>
+      <w:lvlText w:val="%4."/>
+      <w:lvlJc w:val="left"/>
+      <w:pPr>
+        <w:ind w:left="2520" w:hanging="360"/>
+      </w:pPr>
+    </w:lvl>
+    <w:lvl w:ilvl="4" w:tplc="240A0019" w:tentative="1">
+      <w:start w:val="1"/>
+      <w:numFmt w:val="lowerLetter"/>
+      <w:lvlText w:val="%5."/>
+      <w:lvlJc w:val="left"/>
+      <w:pPr>
+        <w:ind w:left="3240" w:hanging="360"/>
+      </w:pPr>
+    </w:lvl>
+    <w:lvl w:ilvl="5" w:tplc="240A001B" w:tentative="1">
+      <w:start w:val="1"/>
+      <w:numFmt w:val="lowerRoman"/>
+      <w:lvlText w:val="%6."/>
+      <w:lvlJc w:val="right"/>
+      <w:pPr>
+        <w:ind w:left="3960" w:hanging="180"/>
+      </w:pPr>
+    </w:lvl>
+    <w:lvl w:ilvl="6" w:tplc="240A000F" w:tentative="1">
+      <w:start w:val="1"/>
+      <w:numFmt w:val="decimal"/>
+      <w:lvlText w:val="%7."/>
+      <w:lvlJc w:val="left"/>
+      <w:pPr>
+        <w:ind w:left="4680" w:hanging="360"/>
+      </w:pPr>
+    </w:lvl>
+    <w:lvl w:ilvl="7" w:tplc="240A0019" w:tentative="1">
+      <w:start w:val="1"/>
+      <w:numFmt w:val="lowerLetter"/>
+      <w:lvlText w:val="%8."/>
+      <w:lvlJc w:val="left"/>
+      <w:pPr>
+        <w:ind w:left="5400" w:hanging="360"/>
+      </w:pPr>
+    </w:lvl>
+    <w:lvl w:ilvl="8" w:tplc="240A001B" w:tentative="1">
+      <w:start w:val="1"/>
+      <w:numFmt w:val="lowerRoman"/>
+      <w:lvlText w:val="%9."/>
+      <w:lvlJc w:val="right"/>
+      <w:pPr>
+        <w:ind w:left="6120" w:hanging="180"/>
+      </w:pPr>
+    </w:lvl>
+  </w:abstractNum>
+  <w:abstractNum w:abstractNumId="23" w15:restartNumberingAfterBreak="0">
     <w:nsid w:val="6A3D746A"/>
     <w:multiLevelType w:val="hybridMultilevel"/>
     <w:tmpl w:val="8DEE57FE"/>
@@ -2607,7 +5911,268 @@
       </w:pPr>
     </w:lvl>
   </w:abstractNum>
-  <w:abstractNum w:abstractNumId="13" w15:restartNumberingAfterBreak="0">
+  <w:abstractNum w:abstractNumId="24" w15:restartNumberingAfterBreak="0">
+    <w:nsid w:val="6DA05388"/>
+    <w:multiLevelType w:val="multilevel"/>
+    <w:tmpl w:val="8BA26EF8"/>
+    <w:lvl w:ilvl="0">
+      <w:start w:val="1"/>
+      <w:numFmt w:val="bullet"/>
+      <w:lvlText w:val=""/>
+      <w:lvlJc w:val="left"/>
+      <w:pPr>
+        <w:tabs>
+          <w:tab w:val="num" w:pos="720"/>
+        </w:tabs>
+        <w:ind w:left="720" w:hanging="360"/>
+      </w:pPr>
+      <w:rPr>
+        <w:rFonts w:ascii="Symbol" w:hAnsi="Symbol" w:hint="default"/>
+        <w:sz w:val="20"/>
+      </w:rPr>
+    </w:lvl>
+    <w:lvl w:ilvl="1">
+      <w:start w:val="1"/>
+      <w:numFmt w:val="bullet"/>
+      <w:lvlText w:val="o"/>
+      <w:lvlJc w:val="left"/>
+      <w:pPr>
+        <w:tabs>
+          <w:tab w:val="num" w:pos="1440"/>
+        </w:tabs>
+        <w:ind w:left="1440" w:hanging="360"/>
+      </w:pPr>
+      <w:rPr>
+        <w:rFonts w:ascii="Courier New" w:hAnsi="Courier New" w:hint="default"/>
+        <w:sz w:val="20"/>
+      </w:rPr>
+    </w:lvl>
+    <w:lvl w:ilvl="2" w:tentative="1">
+      <w:start w:val="1"/>
+      <w:numFmt w:val="bullet"/>
+      <w:lvlText w:val=""/>
+      <w:lvlJc w:val="left"/>
+      <w:pPr>
+        <w:tabs>
+          <w:tab w:val="num" w:pos="2160"/>
+        </w:tabs>
+        <w:ind w:left="2160" w:hanging="360"/>
+      </w:pPr>
+      <w:rPr>
+        <w:rFonts w:ascii="Wingdings" w:hAnsi="Wingdings" w:hint="default"/>
+        <w:sz w:val="20"/>
+      </w:rPr>
+    </w:lvl>
+    <w:lvl w:ilvl="3" w:tentative="1">
+      <w:start w:val="1"/>
+      <w:numFmt w:val="bullet"/>
+      <w:lvlText w:val=""/>
+      <w:lvlJc w:val="left"/>
+      <w:pPr>
+        <w:tabs>
+          <w:tab w:val="num" w:pos="2880"/>
+        </w:tabs>
+        <w:ind w:left="2880" w:hanging="360"/>
+      </w:pPr>
+      <w:rPr>
+        <w:rFonts w:ascii="Wingdings" w:hAnsi="Wingdings" w:hint="default"/>
+        <w:sz w:val="20"/>
+      </w:rPr>
+    </w:lvl>
+    <w:lvl w:ilvl="4" w:tentative="1">
+      <w:start w:val="1"/>
+      <w:numFmt w:val="bullet"/>
+      <w:lvlText w:val=""/>
+      <w:lvlJc w:val="left"/>
+      <w:pPr>
+        <w:tabs>
+          <w:tab w:val="num" w:pos="3600"/>
+        </w:tabs>
+        <w:ind w:left="3600" w:hanging="360"/>
+      </w:pPr>
+      <w:rPr>
+        <w:rFonts w:ascii="Wingdings" w:hAnsi="Wingdings" w:hint="default"/>
+        <w:sz w:val="20"/>
+      </w:rPr>
+    </w:lvl>
+    <w:lvl w:ilvl="5" w:tentative="1">
+      <w:start w:val="1"/>
+      <w:numFmt w:val="bullet"/>
+      <w:lvlText w:val=""/>
+      <w:lvlJc w:val="left"/>
+      <w:pPr>
+        <w:tabs>
+          <w:tab w:val="num" w:pos="4320"/>
+        </w:tabs>
+        <w:ind w:left="4320" w:hanging="360"/>
+      </w:pPr>
+      <w:rPr>
+        <w:rFonts w:ascii="Wingdings" w:hAnsi="Wingdings" w:hint="default"/>
+        <w:sz w:val="20"/>
+      </w:rPr>
+    </w:lvl>
+    <w:lvl w:ilvl="6" w:tentative="1">
+      <w:start w:val="1"/>
+      <w:numFmt w:val="bullet"/>
+      <w:lvlText w:val=""/>
+      <w:lvlJc w:val="left"/>
+      <w:pPr>
+        <w:tabs>
+          <w:tab w:val="num" w:pos="5040"/>
+        </w:tabs>
+        <w:ind w:left="5040" w:hanging="360"/>
+      </w:pPr>
+      <w:rPr>
+        <w:rFonts w:ascii="Wingdings" w:hAnsi="Wingdings" w:hint="default"/>
+        <w:sz w:val="20"/>
+      </w:rPr>
+    </w:lvl>
+    <w:lvl w:ilvl="7" w:tentative="1">
+      <w:start w:val="1"/>
+      <w:numFmt w:val="bullet"/>
+      <w:lvlText w:val=""/>
+      <w:lvlJc w:val="left"/>
+      <w:pPr>
+        <w:tabs>
+          <w:tab w:val="num" w:pos="5760"/>
+        </w:tabs>
+        <w:ind w:left="5760" w:hanging="360"/>
+      </w:pPr>
+      <w:rPr>
+        <w:rFonts w:ascii="Wingdings" w:hAnsi="Wingdings" w:hint="default"/>
+        <w:sz w:val="20"/>
+      </w:rPr>
+    </w:lvl>
+    <w:lvl w:ilvl="8" w:tentative="1">
+      <w:start w:val="1"/>
+      <w:numFmt w:val="bullet"/>
+      <w:lvlText w:val=""/>
+      <w:lvlJc w:val="left"/>
+      <w:pPr>
+        <w:tabs>
+          <w:tab w:val="num" w:pos="6480"/>
+        </w:tabs>
+        <w:ind w:left="6480" w:hanging="360"/>
+      </w:pPr>
+      <w:rPr>
+        <w:rFonts w:ascii="Wingdings" w:hAnsi="Wingdings" w:hint="default"/>
+        <w:sz w:val="20"/>
+      </w:rPr>
+    </w:lvl>
+  </w:abstractNum>
+  <w:abstractNum w:abstractNumId="25" w15:restartNumberingAfterBreak="0">
+    <w:nsid w:val="6E395AE0"/>
+    <w:multiLevelType w:val="hybridMultilevel"/>
+    <w:tmpl w:val="6FC2EAD4"/>
+    <w:lvl w:ilvl="0" w:tplc="42288282">
+      <w:numFmt w:val="bullet"/>
+      <w:lvlText w:val="•"/>
+      <w:lvlJc w:val="left"/>
+      <w:pPr>
+        <w:ind w:left="720" w:hanging="360"/>
+      </w:pPr>
+      <w:rPr>
+        <w:rFonts w:ascii="Times New Roman" w:eastAsia="Times New Roman" w:hAnsi="Times New Roman" w:cs="Times New Roman" w:hint="default"/>
+      </w:rPr>
+    </w:lvl>
+    <w:lvl w:ilvl="1" w:tplc="240A0003" w:tentative="1">
+      <w:start w:val="1"/>
+      <w:numFmt w:val="bullet"/>
+      <w:lvlText w:val="o"/>
+      <w:lvlJc w:val="left"/>
+      <w:pPr>
+        <w:ind w:left="1440" w:hanging="360"/>
+      </w:pPr>
+      <w:rPr>
+        <w:rFonts w:ascii="Courier New" w:hAnsi="Courier New" w:cs="Courier New" w:hint="default"/>
+      </w:rPr>
+    </w:lvl>
+    <w:lvl w:ilvl="2" w:tplc="240A0005" w:tentative="1">
+      <w:start w:val="1"/>
+      <w:numFmt w:val="bullet"/>
+      <w:lvlText w:val=""/>
+      <w:lvlJc w:val="left"/>
+      <w:pPr>
+        <w:ind w:left="2160" w:hanging="360"/>
+      </w:pPr>
+      <w:rPr>
+        <w:rFonts w:ascii="Wingdings" w:hAnsi="Wingdings" w:hint="default"/>
+      </w:rPr>
+    </w:lvl>
+    <w:lvl w:ilvl="3" w:tplc="240A0001" w:tentative="1">
+      <w:start w:val="1"/>
+      <w:numFmt w:val="bullet"/>
+      <w:lvlText w:val=""/>
+      <w:lvlJc w:val="left"/>
+      <w:pPr>
+        <w:ind w:left="2880" w:hanging="360"/>
+      </w:pPr>
+      <w:rPr>
+        <w:rFonts w:ascii="Symbol" w:hAnsi="Symbol" w:hint="default"/>
+      </w:rPr>
+    </w:lvl>
+    <w:lvl w:ilvl="4" w:tplc="240A0003" w:tentative="1">
+      <w:start w:val="1"/>
+      <w:numFmt w:val="bullet"/>
+      <w:lvlText w:val="o"/>
+      <w:lvlJc w:val="left"/>
+      <w:pPr>
+        <w:ind w:left="3600" w:hanging="360"/>
+      </w:pPr>
+      <w:rPr>
+        <w:rFonts w:ascii="Courier New" w:hAnsi="Courier New" w:cs="Courier New" w:hint="default"/>
+      </w:rPr>
+    </w:lvl>
+    <w:lvl w:ilvl="5" w:tplc="240A0005" w:tentative="1">
+      <w:start w:val="1"/>
+      <w:numFmt w:val="bullet"/>
+      <w:lvlText w:val=""/>
+      <w:lvlJc w:val="left"/>
+      <w:pPr>
+        <w:ind w:left="4320" w:hanging="360"/>
+      </w:pPr>
+      <w:rPr>
+        <w:rFonts w:ascii="Wingdings" w:hAnsi="Wingdings" w:hint="default"/>
+      </w:rPr>
+    </w:lvl>
+    <w:lvl w:ilvl="6" w:tplc="240A0001" w:tentative="1">
+      <w:start w:val="1"/>
+      <w:numFmt w:val="bullet"/>
+      <w:lvlText w:val=""/>
+      <w:lvlJc w:val="left"/>
+      <w:pPr>
+        <w:ind w:left="5040" w:hanging="360"/>
+      </w:pPr>
+      <w:rPr>
+        <w:rFonts w:ascii="Symbol" w:hAnsi="Symbol" w:hint="default"/>
+      </w:rPr>
+    </w:lvl>
+    <w:lvl w:ilvl="7" w:tplc="240A0003" w:tentative="1">
+      <w:start w:val="1"/>
+      <w:numFmt w:val="bullet"/>
+      <w:lvlText w:val="o"/>
+      <w:lvlJc w:val="left"/>
+      <w:pPr>
+        <w:ind w:left="5760" w:hanging="360"/>
+      </w:pPr>
+      <w:rPr>
+        <w:rFonts w:ascii="Courier New" w:hAnsi="Courier New" w:cs="Courier New" w:hint="default"/>
+      </w:rPr>
+    </w:lvl>
+    <w:lvl w:ilvl="8" w:tplc="240A0005" w:tentative="1">
+      <w:start w:val="1"/>
+      <w:numFmt w:val="bullet"/>
+      <w:lvlText w:val=""/>
+      <w:lvlJc w:val="left"/>
+      <w:pPr>
+        <w:ind w:left="6480" w:hanging="360"/>
+      </w:pPr>
+      <w:rPr>
+        <w:rFonts w:ascii="Wingdings" w:hAnsi="Wingdings" w:hint="default"/>
+      </w:rPr>
+    </w:lvl>
+  </w:abstractNum>
+  <w:abstractNum w:abstractNumId="26" w15:restartNumberingAfterBreak="0">
     <w:nsid w:val="72B720B0"/>
     <w:multiLevelType w:val="multilevel"/>
     <w:tmpl w:val="533200E2"/>
@@ -2756,7 +6321,7 @@
       </w:rPr>
     </w:lvl>
   </w:abstractNum>
-  <w:abstractNum w:abstractNumId="14" w15:restartNumberingAfterBreak="0">
+  <w:abstractNum w:abstractNumId="27" w15:restartNumberingAfterBreak="0">
     <w:nsid w:val="74E70C6A"/>
     <w:multiLevelType w:val="hybridMultilevel"/>
     <w:tmpl w:val="76D43B7E"/>
@@ -2846,7 +6411,120 @@
       </w:pPr>
     </w:lvl>
   </w:abstractNum>
-  <w:abstractNum w:abstractNumId="15" w15:restartNumberingAfterBreak="0">
+  <w:abstractNum w:abstractNumId="28" w15:restartNumberingAfterBreak="0">
+    <w:nsid w:val="7625472C"/>
+    <w:multiLevelType w:val="multilevel"/>
+    <w:tmpl w:val="40AA2F88"/>
+    <w:lvl w:ilvl="0">
+      <w:start w:val="1"/>
+      <w:numFmt w:val="decimal"/>
+      <w:lvlText w:val="%1."/>
+      <w:lvlJc w:val="left"/>
+      <w:pPr>
+        <w:tabs>
+          <w:tab w:val="num" w:pos="720"/>
+        </w:tabs>
+        <w:ind w:left="720" w:hanging="360"/>
+      </w:pPr>
+    </w:lvl>
+    <w:lvl w:ilvl="1" w:tentative="1">
+      <w:start w:val="1"/>
+      <w:numFmt w:val="decimal"/>
+      <w:lvlText w:val="%2."/>
+      <w:lvlJc w:val="left"/>
+      <w:pPr>
+        <w:tabs>
+          <w:tab w:val="num" w:pos="1440"/>
+        </w:tabs>
+        <w:ind w:left="1440" w:hanging="360"/>
+      </w:pPr>
+    </w:lvl>
+    <w:lvl w:ilvl="2" w:tentative="1">
+      <w:start w:val="1"/>
+      <w:numFmt w:val="decimal"/>
+      <w:lvlText w:val="%3."/>
+      <w:lvlJc w:val="left"/>
+      <w:pPr>
+        <w:tabs>
+          <w:tab w:val="num" w:pos="2160"/>
+        </w:tabs>
+        <w:ind w:left="2160" w:hanging="360"/>
+      </w:pPr>
+    </w:lvl>
+    <w:lvl w:ilvl="3" w:tentative="1">
+      <w:start w:val="1"/>
+      <w:numFmt w:val="decimal"/>
+      <w:lvlText w:val="%4."/>
+      <w:lvlJc w:val="left"/>
+      <w:pPr>
+        <w:tabs>
+          <w:tab w:val="num" w:pos="2880"/>
+        </w:tabs>
+        <w:ind w:left="2880" w:hanging="360"/>
+      </w:pPr>
+    </w:lvl>
+    <w:lvl w:ilvl="4" w:tentative="1">
+      <w:start w:val="1"/>
+      <w:numFmt w:val="decimal"/>
+      <w:lvlText w:val="%5."/>
+      <w:lvlJc w:val="left"/>
+      <w:pPr>
+        <w:tabs>
+          <w:tab w:val="num" w:pos="3600"/>
+        </w:tabs>
+        <w:ind w:left="3600" w:hanging="360"/>
+      </w:pPr>
+    </w:lvl>
+    <w:lvl w:ilvl="5" w:tentative="1">
+      <w:start w:val="1"/>
+      <w:numFmt w:val="decimal"/>
+      <w:lvlText w:val="%6."/>
+      <w:lvlJc w:val="left"/>
+      <w:pPr>
+        <w:tabs>
+          <w:tab w:val="num" w:pos="4320"/>
+        </w:tabs>
+        <w:ind w:left="4320" w:hanging="360"/>
+      </w:pPr>
+    </w:lvl>
+    <w:lvl w:ilvl="6" w:tentative="1">
+      <w:start w:val="1"/>
+      <w:numFmt w:val="decimal"/>
+      <w:lvlText w:val="%7."/>
+      <w:lvlJc w:val="left"/>
+      <w:pPr>
+        <w:tabs>
+          <w:tab w:val="num" w:pos="5040"/>
+        </w:tabs>
+        <w:ind w:left="5040" w:hanging="360"/>
+      </w:pPr>
+    </w:lvl>
+    <w:lvl w:ilvl="7" w:tentative="1">
+      <w:start w:val="1"/>
+      <w:numFmt w:val="decimal"/>
+      <w:lvlText w:val="%8."/>
+      <w:lvlJc w:val="left"/>
+      <w:pPr>
+        <w:tabs>
+          <w:tab w:val="num" w:pos="5760"/>
+        </w:tabs>
+        <w:ind w:left="5760" w:hanging="360"/>
+      </w:pPr>
+    </w:lvl>
+    <w:lvl w:ilvl="8" w:tentative="1">
+      <w:start w:val="1"/>
+      <w:numFmt w:val="decimal"/>
+      <w:lvlText w:val="%9."/>
+      <w:lvlJc w:val="left"/>
+      <w:pPr>
+        <w:tabs>
+          <w:tab w:val="num" w:pos="6480"/>
+        </w:tabs>
+        <w:ind w:left="6480" w:hanging="360"/>
+      </w:pPr>
+    </w:lvl>
+  </w:abstractNum>
+  <w:abstractNum w:abstractNumId="29" w15:restartNumberingAfterBreak="0">
     <w:nsid w:val="7D1E3D5E"/>
     <w:multiLevelType w:val="multilevel"/>
     <w:tmpl w:val="E794B4AC"/>
@@ -2996,52 +6674,94 @@
     </w:lvl>
   </w:abstractNum>
   <w:num w:numId="1" w16cid:durableId="119105534">
+    <w:abstractNumId w:val="9"/>
+  </w:num>
+  <w:num w:numId="2" w16cid:durableId="263852468">
+    <w:abstractNumId w:val="19"/>
+  </w:num>
+  <w:num w:numId="3" w16cid:durableId="494692360">
+    <w:abstractNumId w:val="23"/>
+  </w:num>
+  <w:num w:numId="4" w16cid:durableId="706611985">
+    <w:abstractNumId w:val="15"/>
+  </w:num>
+  <w:num w:numId="5" w16cid:durableId="1063017730">
+    <w:abstractNumId w:val="21"/>
+  </w:num>
+  <w:num w:numId="6" w16cid:durableId="83189123">
+    <w:abstractNumId w:val="14"/>
+  </w:num>
+  <w:num w:numId="7" w16cid:durableId="1952976107">
+    <w:abstractNumId w:val="20"/>
+  </w:num>
+  <w:num w:numId="8" w16cid:durableId="1180856906">
+    <w:abstractNumId w:val="13"/>
+  </w:num>
+  <w:num w:numId="9" w16cid:durableId="1664358039">
+    <w:abstractNumId w:val="29"/>
+  </w:num>
+  <w:num w:numId="10" w16cid:durableId="2146851233">
     <w:abstractNumId w:val="4"/>
   </w:num>
-  <w:num w:numId="2" w16cid:durableId="263852468">
-    <w:abstractNumId w:val="9"/>
+  <w:num w:numId="11" w16cid:durableId="680544414">
+    <w:abstractNumId w:val="26"/>
   </w:num>
-  <w:num w:numId="3" w16cid:durableId="494692360">
+  <w:num w:numId="12" w16cid:durableId="937444820">
+    <w:abstractNumId w:val="2"/>
+  </w:num>
+  <w:num w:numId="13" w16cid:durableId="2118988235">
+    <w:abstractNumId w:val="7"/>
+  </w:num>
+  <w:num w:numId="14" w16cid:durableId="1500385921">
+    <w:abstractNumId w:val="16"/>
+  </w:num>
+  <w:num w:numId="15" w16cid:durableId="1688944900">
+    <w:abstractNumId w:val="27"/>
+  </w:num>
+  <w:num w:numId="16" w16cid:durableId="1038117401">
+    <w:abstractNumId w:val="3"/>
+  </w:num>
+  <w:num w:numId="17" w16cid:durableId="499010399">
+    <w:abstractNumId w:val="1"/>
+  </w:num>
+  <w:num w:numId="18" w16cid:durableId="517814488">
     <w:abstractNumId w:val="12"/>
   </w:num>
-  <w:num w:numId="4" w16cid:durableId="706611985">
-    <w:abstractNumId w:val="7"/>
+  <w:num w:numId="19" w16cid:durableId="1476410829">
+    <w:abstractNumId w:val="24"/>
   </w:num>
-  <w:num w:numId="5" w16cid:durableId="1063017730">
+  <w:num w:numId="20" w16cid:durableId="179784519">
+    <w:abstractNumId w:val="10"/>
+  </w:num>
+  <w:num w:numId="21" w16cid:durableId="1056663144">
     <w:abstractNumId w:val="11"/>
   </w:num>
-  <w:num w:numId="6" w16cid:durableId="83189123">
+  <w:num w:numId="22" w16cid:durableId="2036230494">
+    <w:abstractNumId w:val="28"/>
+  </w:num>
+  <w:num w:numId="23" w16cid:durableId="819342795">
+    <w:abstractNumId w:val="0"/>
+  </w:num>
+  <w:num w:numId="24" w16cid:durableId="1141730161">
+    <w:abstractNumId w:val="5"/>
+  </w:num>
+  <w:num w:numId="25" w16cid:durableId="486553042">
+    <w:abstractNumId w:val="25"/>
+  </w:num>
+  <w:num w:numId="26" w16cid:durableId="1159613222">
+    <w:abstractNumId w:val="8"/>
+  </w:num>
+  <w:num w:numId="27" w16cid:durableId="2005473678">
     <w:abstractNumId w:val="6"/>
   </w:num>
-  <w:num w:numId="7" w16cid:durableId="1952976107">
-    <w:abstractNumId w:val="10"/>
+  <w:num w:numId="28" w16cid:durableId="2025788025">
+    <w:abstractNumId w:val="22"/>
   </w:num>
-  <w:num w:numId="8" w16cid:durableId="1180856906">
-    <w:abstractNumId w:val="5"/>
+  <w:num w:numId="29" w16cid:durableId="639769779">
+    <w:abstractNumId w:val="18"/>
   </w:num>
-  <w:num w:numId="9" w16cid:durableId="1664358039">
-    <w:abstractNumId w:val="15"/>
-  </w:num>
-  <w:num w:numId="10" w16cid:durableId="2146851233">
-    <w:abstractNumId w:val="2"/>
-  </w:num>
-  <w:num w:numId="11" w16cid:durableId="680544414">
-    <w:abstractNumId w:val="13"/>
-  </w:num>
-  <w:num w:numId="12" w16cid:durableId="937444820">
-    <w:abstractNumId w:val="0"/>
-  </w:num>
-  <w:num w:numId="13" w16cid:durableId="2118988235">
-    <w:abstractNumId w:val="3"/>
-  </w:num>
-  <w:num w:numId="14" w16cid:durableId="1500385921">
-    <w:abstractNumId w:val="8"/>
-  </w:num>
-  <w:num w:numId="15" w16cid:durableId="1688944900">
-    <w:abstractNumId w:val="14"/>
-  </w:num>
-  <w:num w:numId="16" w16cid:durableId="1038117401">
-    <w:abstractNumId w:val="1"/>
+  <w:num w:numId="30" w16cid:durableId="35738400">
+    <w:abstractNumId w:val="17"/>
   </w:num>
 </w:numbering>
 </file>
@@ -3567,7 +7287,6 @@
   <w:style w:type="character" w:default="1" w:styleId="Fuentedeprrafopredeter">
     <w:name w:val="Default Paragraph Font"/>
     <w:uiPriority w:val="1"/>
-    <w:semiHidden/>
     <w:unhideWhenUsed/>
   </w:style>
   <w:style w:type="table" w:default="1" w:styleId="Tablanormal">

</xml_diff>